<commit_message>
now with the matching docx
</commit_message>
<xml_diff>
--- a/dialogue_only_script.docx
+++ b/dialogue_only_script.docx
@@ -1347,24 +1347,41 @@
           <w:szCs w:val="24"/>
           <w:rtl w:val="0"/>
         </w:rPr>
-        <w:t xml:space="preserve">(----)</w:t>
-      </w:r>
-    </w:p>
-    <w:p>
-      <w:pPr>
-        <w:spacing w:after="200" w:lineRule="auto"/>
-        <w:rPr>
-          <w:sz w:val="24"/>
-          <w:szCs w:val="24"/>
-        </w:rPr>
-      </w:pPr>
-      <w:r>
-        <w:rPr>
-          <w:sz w:val="24"/>
-          <w:szCs w:val="24"/>
-          <w:rtl w:val="0"/>
-        </w:rPr>
-        <w:t xml:space="preserve">Hey, Paul. - Yeah?</w:t>
+        <w:t xml:space="preserve">[blank]</w:t>
+      </w:r>
+    </w:p>
+    <w:p>
+      <w:pPr>
+        <w:spacing w:after="200" w:lineRule="auto"/>
+        <w:rPr>
+          <w:sz w:val="24"/>
+          <w:szCs w:val="24"/>
+        </w:rPr>
+      </w:pPr>
+      <w:r>
+        <w:rPr>
+          <w:sz w:val="24"/>
+          <w:szCs w:val="24"/>
+          <w:rtl w:val="0"/>
+        </w:rPr>
+        <w:t xml:space="preserve">Hey, Paul. </w:t>
+      </w:r>
+    </w:p>
+    <w:p>
+      <w:pPr>
+        <w:spacing w:after="200" w:lineRule="auto"/>
+        <w:rPr>
+          <w:sz w:val="24"/>
+          <w:szCs w:val="24"/>
+        </w:rPr>
+      </w:pPr>
+      <w:r>
+        <w:rPr>
+          <w:sz w:val="24"/>
+          <w:szCs w:val="24"/>
+          <w:rtl w:val="0"/>
+        </w:rPr>
+        <w:t xml:space="preserve">Yeah?</w:t>
       </w:r>
     </w:p>
     <w:p>
@@ -2956,7 +2973,7 @@
           <w:szCs w:val="24"/>
           <w:rtl w:val="0"/>
         </w:rPr>
-        <w:t xml:space="preserve">(----)</w:t>
+        <w:t xml:space="preserve">[blank]</w:t>
       </w:r>
     </w:p>
     <w:p>
@@ -3031,7 +3048,7 @@
     </w:p>
     <w:p>
       <w:pPr>
-        <w:spacing w:after="200" w:lineRule="auto"/>
+        <w:widowControl w:val="0"/>
         <w:rPr>
           <w:sz w:val="24"/>
           <w:szCs w:val="24"/>
@@ -3803,7 +3820,7 @@
           <w:rtl w:val="0"/>
         </w:rPr>
         <w:br w:type="textWrapping"/>
-        <w:t xml:space="preserve">It’s another job piled on top of my already shitty paying job. </w:t>
+        <w:t xml:space="preserve">It’s just another job piled on top of my already shitty paying job. </w:t>
       </w:r>
     </w:p>
     <w:p>
@@ -3866,8 +3883,40 @@
           <w:rtl w:val="0"/>
         </w:rPr>
         <w:t xml:space="preserve">have to make coffee for these assholes! </w:t>
-        <w:br w:type="textWrapping"/>
-        <w:br w:type="textWrapping"/>
+      </w:r>
+    </w:p>
+    <w:p>
+      <w:pPr>
+        <w:widowControl w:val="0"/>
+        <w:spacing w:before="23" w:lineRule="auto"/>
+        <w:ind w:right="45"/>
+        <w:rPr>
+          <w:sz w:val="24"/>
+          <w:szCs w:val="24"/>
+        </w:rPr>
+      </w:pPr>
+      <w:r>
+        <w:rPr>
+          <w:rtl w:val="0"/>
+        </w:rPr>
+      </w:r>
+    </w:p>
+    <w:p>
+      <w:pPr>
+        <w:widowControl w:val="0"/>
+        <w:spacing w:before="23" w:lineRule="auto"/>
+        <w:ind w:right="45"/>
+        <w:rPr>
+          <w:sz w:val="24"/>
+          <w:szCs w:val="24"/>
+        </w:rPr>
+      </w:pPr>
+      <w:r>
+        <w:rPr>
+          <w:sz w:val="24"/>
+          <w:szCs w:val="24"/>
+          <w:rtl w:val="0"/>
+        </w:rPr>
         <w:t xml:space="preserve">Not that you’re an asshole. Well, you </w:t>
       </w:r>
       <w:r>
@@ -3889,9 +3938,76 @@
         <w:t xml:space="preserve">be an asshole. </w:t>
         <w:br w:type="textWrapping"/>
         <w:br w:type="textWrapping"/>
-        <w:t xml:space="preserve">How much did you tip? Five bucks! </w:t>
-        <w:br w:type="textWrapping"/>
-        <w:br w:type="textWrapping"/>
+        <w:t xml:space="preserve">How much did you tip? </w:t>
+      </w:r>
+    </w:p>
+    <w:p>
+      <w:pPr>
+        <w:widowControl w:val="0"/>
+        <w:spacing w:before="23" w:lineRule="auto"/>
+        <w:ind w:right="45"/>
+        <w:rPr>
+          <w:sz w:val="24"/>
+          <w:szCs w:val="24"/>
+        </w:rPr>
+      </w:pPr>
+      <w:r>
+        <w:rPr>
+          <w:rtl w:val="0"/>
+        </w:rPr>
+      </w:r>
+    </w:p>
+    <w:p>
+      <w:pPr>
+        <w:widowControl w:val="0"/>
+        <w:spacing w:before="23" w:lineRule="auto"/>
+        <w:ind w:right="45"/>
+        <w:rPr>
+          <w:sz w:val="24"/>
+          <w:szCs w:val="24"/>
+        </w:rPr>
+      </w:pPr>
+      <w:r>
+        <w:rPr>
+          <w:sz w:val="24"/>
+          <w:szCs w:val="24"/>
+          <w:rtl w:val="0"/>
+        </w:rPr>
+        <w:t xml:space="preserve">Five bucks! </w:t>
+      </w:r>
+    </w:p>
+    <w:p>
+      <w:pPr>
+        <w:widowControl w:val="0"/>
+        <w:spacing w:before="23" w:lineRule="auto"/>
+        <w:ind w:right="45"/>
+        <w:rPr>
+          <w:sz w:val="24"/>
+          <w:szCs w:val="24"/>
+        </w:rPr>
+      </w:pPr>
+      <w:r>
+        <w:rPr>
+          <w:rtl w:val="0"/>
+        </w:rPr>
+      </w:r>
+    </w:p>
+    <w:p>
+      <w:pPr>
+        <w:widowControl w:val="0"/>
+        <w:spacing w:before="23" w:lineRule="auto"/>
+        <w:ind w:right="45"/>
+        <w:rPr>
+          <w:sz w:val="24"/>
+          <w:szCs w:val="24"/>
+        </w:rPr>
+      </w:pPr>
+      <w:r>
+        <w:rPr>
+          <w:sz w:val="24"/>
+          <w:szCs w:val="24"/>
+          <w:rtl w:val="0"/>
+        </w:rPr>
         <w:t xml:space="preserve">You meant this just for me, right? </w:t>
         <w:br w:type="textWrapping"/>
         <w:br w:type="textWrapping"/>
@@ -3992,7 +4108,7 @@
         <w:t xml:space="preserve">younger than me. </w:t>
         <w:br w:type="textWrapping"/>
         <w:br w:type="textWrapping"/>
-        <w:t xml:space="preserve">She’s hired all her little theater friends, </w:t>
+        <w:t xml:space="preserve">She hired all her little theater friends, </w:t>
         <w:br w:type="textWrapping"/>
         <w:br w:type="textWrapping"/>
         <w:t xml:space="preserve">and they will not shut the fuck up about some </w:t>
@@ -4312,19 +4428,50 @@
     </w:p>
     <w:p>
       <w:pPr>
-        <w:spacing w:after="200" w:lineRule="auto"/>
-        <w:rPr>
-          <w:sz w:val="24"/>
-          <w:szCs w:val="24"/>
-        </w:rPr>
-      </w:pPr>
-      <w:r>
-        <w:rPr>
-          <w:sz w:val="24"/>
-          <w:szCs w:val="24"/>
-          <w:rtl w:val="0"/>
-        </w:rPr>
-        <w:t xml:space="preserve">(----)</w:t>
+        <w:widowControl w:val="0"/>
+        <w:spacing w:before="24" w:lineRule="auto"/>
+        <w:rPr>
+          <w:sz w:val="24"/>
+          <w:szCs w:val="24"/>
+        </w:rPr>
+      </w:pPr>
+      <w:r>
+        <w:rPr>
+          <w:rtl w:val="0"/>
+        </w:rPr>
+      </w:r>
+    </w:p>
+    <w:p>
+      <w:pPr>
+        <w:widowControl w:val="0"/>
+        <w:spacing w:before="24" w:lineRule="auto"/>
+        <w:rPr>
+          <w:sz w:val="24"/>
+          <w:szCs w:val="24"/>
+        </w:rPr>
+      </w:pPr>
+      <w:r>
+        <w:rPr>
+          <w:sz w:val="24"/>
+          <w:szCs w:val="24"/>
+          <w:rtl w:val="0"/>
+        </w:rPr>
+        <w:t xml:space="preserve">[blank]</w:t>
+      </w:r>
+    </w:p>
+    <w:p>
+      <w:pPr>
+        <w:widowControl w:val="0"/>
+        <w:spacing w:before="24" w:lineRule="auto"/>
+        <w:rPr>
+          <w:sz w:val="24"/>
+          <w:szCs w:val="24"/>
+        </w:rPr>
+      </w:pPr>
+      <w:r>
+        <w:rPr>
+          <w:rtl w:val="0"/>
+        </w:rPr>
       </w:r>
     </w:p>
     <w:p>
@@ -4385,7 +4532,7 @@
           <w:szCs w:val="24"/>
           <w:rtl w:val="0"/>
         </w:rPr>
-        <w:t xml:space="preserve">Hi! -</w:t>
+        <w:t xml:space="preserve">Hi! </w:t>
       </w:r>
     </w:p>
     <w:p>
@@ -4470,24 +4617,7 @@
           <w:szCs w:val="24"/>
           <w:rtl w:val="0"/>
         </w:rPr>
-        <w:t xml:space="preserve">I just wanna talk to you about all the ways you can help </w:t>
-      </w:r>
-    </w:p>
-    <w:p>
-      <w:pPr>
-        <w:spacing w:after="200" w:lineRule="auto"/>
-        <w:rPr>
-          <w:sz w:val="24"/>
-          <w:szCs w:val="24"/>
-        </w:rPr>
-      </w:pPr>
-      <w:r>
-        <w:rPr>
-          <w:sz w:val="24"/>
-          <w:szCs w:val="24"/>
-          <w:rtl w:val="0"/>
-        </w:rPr>
-        <w:t xml:space="preserve">contribute to Greenpeace’s efforts around the globe…</w:t>
+        <w:t xml:space="preserve">I just wanna talk to you about all the ways you can help contribute to Greenpeace’s efforts around the globe…</w:t>
       </w:r>
     </w:p>
     <w:p>
@@ -5741,7 +5871,7 @@
           <w:szCs w:val="24"/>
           <w:rtl w:val="0"/>
         </w:rPr>
-        <w:t xml:space="preserve">[----]</w:t>
+        <w:t xml:space="preserve">[blank]</w:t>
       </w:r>
     </w:p>
     <w:p>
@@ -7642,7 +7772,7 @@
           <w:szCs w:val="24"/>
           <w:rtl w:val="0"/>
         </w:rPr>
-        <w:t xml:space="preserve">(----)</w:t>
+        <w:t xml:space="preserve">[blank]</w:t>
       </w:r>
     </w:p>
     <w:p>
@@ -10184,7 +10314,7 @@
           <w:szCs w:val="24"/>
           <w:rtl w:val="0"/>
         </w:rPr>
-        <w:t xml:space="preserve">(----)</w:t>
+        <w:t xml:space="preserve">[blank]</w:t>
       </w:r>
     </w:p>
     <w:p>
@@ -10600,7 +10730,7 @@
           <w:szCs w:val="24"/>
           <w:rtl w:val="0"/>
         </w:rPr>
-        <w:t xml:space="preserve">(----)</w:t>
+        <w:t xml:space="preserve">[blank]</w:t>
       </w:r>
     </w:p>
     <w:p>
@@ -10662,6 +10792,79 @@
           <w:szCs w:val="24"/>
         </w:rPr>
       </w:pPr>
+      <w:r>
+        <w:rPr>
+          <w:sz w:val="24"/>
+          <w:szCs w:val="24"/>
+          <w:rtl w:val="0"/>
+        </w:rPr>
+        <w:t xml:space="preserve">Why are there so many fucking rats in this shitty alleyway?</w:t>
+      </w:r>
+      <w:r>
+        <w:rPr>
+          <w:rtl w:val="0"/>
+        </w:rPr>
+      </w:r>
+    </w:p>
+    <w:p>
+      <w:pPr>
+        <w:spacing w:after="200" w:lineRule="auto"/>
+        <w:rPr>
+          <w:sz w:val="24"/>
+          <w:szCs w:val="24"/>
+        </w:rPr>
+      </w:pPr>
+      <w:r>
+        <w:rPr>
+          <w:sz w:val="24"/>
+          <w:szCs w:val="24"/>
+          <w:rtl w:val="0"/>
+        </w:rPr>
+        <w:t xml:space="preserve">No no… there was one time a kid threw a bunch of cheese around here…</w:t>
+      </w:r>
+    </w:p>
+    <w:p>
+      <w:pPr>
+        <w:spacing w:after="200" w:lineRule="auto"/>
+        <w:rPr>
+          <w:sz w:val="24"/>
+          <w:szCs w:val="24"/>
+        </w:rPr>
+      </w:pPr>
+      <w:r>
+        <w:rPr>
+          <w:sz w:val="24"/>
+          <w:szCs w:val="24"/>
+          <w:rtl w:val="0"/>
+        </w:rPr>
+        <w:t xml:space="preserve">What?</w:t>
+      </w:r>
+    </w:p>
+    <w:p>
+      <w:pPr>
+        <w:spacing w:after="200" w:lineRule="auto"/>
+        <w:rPr>
+          <w:sz w:val="24"/>
+          <w:szCs w:val="24"/>
+        </w:rPr>
+      </w:pPr>
+      <w:r>
+        <w:rPr>
+          <w:sz w:val="24"/>
+          <w:szCs w:val="24"/>
+          <w:rtl w:val="0"/>
+        </w:rPr>
+        <w:t xml:space="preserve">Yeah, it’s been like 5 years, my dad actually called the exterminator and then -</w:t>
+      </w:r>
+    </w:p>
+    <w:p>
+      <w:pPr>
+        <w:spacing w:after="200" w:lineRule="auto"/>
+        <w:rPr>
+          <w:sz w:val="24"/>
+          <w:szCs w:val="24"/>
+        </w:rPr>
+      </w:pPr>
       <w:commentRangeStart w:id="3"/>
       <w:r>
         <w:rPr>
@@ -10669,7 +10872,24 @@
           <w:szCs w:val="24"/>
           <w:rtl w:val="0"/>
         </w:rPr>
-        <w:t xml:space="preserve">Why are there so many fucking rats in this shitty alleyway?</w:t>
+        <w:t xml:space="preserve">Paul, there are a LOT of dead ends around here </w:t>
+      </w:r>
+    </w:p>
+    <w:p>
+      <w:pPr>
+        <w:spacing w:after="200" w:lineRule="auto"/>
+        <w:rPr>
+          <w:sz w:val="24"/>
+          <w:szCs w:val="24"/>
+        </w:rPr>
+      </w:pPr>
+      <w:r>
+        <w:rPr>
+          <w:sz w:val="24"/>
+          <w:szCs w:val="24"/>
+          <w:rtl w:val="0"/>
+        </w:rPr>
+        <w:t xml:space="preserve">so I just want to make sure you know where you’re going… Are you…?</w:t>
       </w:r>
       <w:commentRangeEnd w:id="3"/>
       <w:r>
@@ -10695,41 +10915,92 @@
           <w:szCs w:val="24"/>
           <w:rtl w:val="0"/>
         </w:rPr>
-        <w:t xml:space="preserve">No no… there was one time a kid threw a bunch of cheese around here…</w:t>
-      </w:r>
-    </w:p>
-    <w:p>
-      <w:pPr>
-        <w:spacing w:after="200" w:lineRule="auto"/>
-        <w:rPr>
-          <w:sz w:val="24"/>
-          <w:szCs w:val="24"/>
-        </w:rPr>
-      </w:pPr>
-      <w:r>
-        <w:rPr>
-          <w:sz w:val="24"/>
-          <w:szCs w:val="24"/>
-          <w:rtl w:val="0"/>
-        </w:rPr>
-        <w:t xml:space="preserve">-What?</w:t>
-      </w:r>
-    </w:p>
-    <w:p>
-      <w:pPr>
-        <w:spacing w:after="200" w:lineRule="auto"/>
-        <w:rPr>
-          <w:sz w:val="24"/>
-          <w:szCs w:val="24"/>
-        </w:rPr>
-      </w:pPr>
-      <w:r>
-        <w:rPr>
-          <w:sz w:val="24"/>
-          <w:szCs w:val="24"/>
-          <w:rtl w:val="0"/>
-        </w:rPr>
-        <w:t xml:space="preserve">Yeah, it’s been like 5 years, my dad actually called the exterminator and then -</w:t>
+        <w:t xml:space="preserve">Yeah no… no. That’s a dead end.</w:t>
+      </w:r>
+    </w:p>
+    <w:p>
+      <w:pPr>
+        <w:spacing w:after="200" w:lineRule="auto"/>
+        <w:rPr>
+          <w:sz w:val="24"/>
+          <w:szCs w:val="24"/>
+        </w:rPr>
+      </w:pPr>
+      <w:r>
+        <w:rPr>
+          <w:sz w:val="24"/>
+          <w:szCs w:val="24"/>
+          <w:rtl w:val="0"/>
+        </w:rPr>
+        <w:t xml:space="preserve">oh…ok….</w:t>
+      </w:r>
+    </w:p>
+    <w:p>
+      <w:pPr>
+        <w:spacing w:after="200" w:lineRule="auto"/>
+        <w:rPr>
+          <w:sz w:val="24"/>
+          <w:szCs w:val="24"/>
+        </w:rPr>
+      </w:pPr>
+      <w:r>
+        <w:rPr>
+          <w:sz w:val="24"/>
+          <w:szCs w:val="24"/>
+          <w:rtl w:val="0"/>
+        </w:rPr>
+        <w:t xml:space="preserve">Let’s go the other way.</w:t>
+      </w:r>
+    </w:p>
+    <w:p>
+      <w:pPr>
+        <w:spacing w:after="200" w:lineRule="auto"/>
+        <w:rPr>
+          <w:sz w:val="24"/>
+          <w:szCs w:val="24"/>
+        </w:rPr>
+      </w:pPr>
+      <w:r>
+        <w:rPr>
+          <w:sz w:val="24"/>
+          <w:szCs w:val="24"/>
+          <w:rtl w:val="0"/>
+        </w:rPr>
+        <w:t xml:space="preserve">So, you know, maybe it’s a bad time…</w:t>
+      </w:r>
+    </w:p>
+    <w:p>
+      <w:pPr>
+        <w:spacing w:after="200" w:lineRule="auto"/>
+        <w:rPr>
+          <w:sz w:val="24"/>
+          <w:szCs w:val="24"/>
+        </w:rPr>
+      </w:pPr>
+      <w:r>
+        <w:rPr>
+          <w:sz w:val="24"/>
+          <w:szCs w:val="24"/>
+          <w:rtl w:val="0"/>
+        </w:rPr>
+        <w:t xml:space="preserve">but do you like film? Cinema?</w:t>
+      </w:r>
+    </w:p>
+    <w:p>
+      <w:pPr>
+        <w:spacing w:after="200" w:lineRule="auto"/>
+        <w:rPr>
+          <w:sz w:val="24"/>
+          <w:szCs w:val="24"/>
+        </w:rPr>
+      </w:pPr>
+      <w:r>
+        <w:rPr>
+          <w:sz w:val="24"/>
+          <w:szCs w:val="24"/>
+          <w:rtl w:val="0"/>
+        </w:rPr>
+        <w:t xml:space="preserve">You know what? Yes. That is… That is a bad time.</w:t>
       </w:r>
     </w:p>
     <w:p>
@@ -10741,154 +11012,8 @@
         </w:rPr>
       </w:pPr>
       <w:commentRangeStart w:id="4"/>
-      <w:r>
-        <w:rPr>
-          <w:sz w:val="24"/>
-          <w:szCs w:val="24"/>
-          <w:rtl w:val="0"/>
-        </w:rPr>
-        <w:t xml:space="preserve">Paul, there are a LOT of dead ends around here </w:t>
-      </w:r>
-    </w:p>
-    <w:p>
-      <w:pPr>
-        <w:spacing w:after="200" w:lineRule="auto"/>
-        <w:rPr>
-          <w:sz w:val="24"/>
-          <w:szCs w:val="24"/>
-        </w:rPr>
-      </w:pPr>
-      <w:r>
-        <w:rPr>
-          <w:sz w:val="24"/>
-          <w:szCs w:val="24"/>
-          <w:rtl w:val="0"/>
-        </w:rPr>
-        <w:t xml:space="preserve">so I just want to make sure you know where you’re going… Are you…?</w:t>
-      </w:r>
-      <w:commentRangeEnd w:id="4"/>
-      <w:r>
-        <w:commentReference w:id="4"/>
-      </w:r>
-      <w:r>
-        <w:rPr>
-          <w:rtl w:val="0"/>
-        </w:rPr>
-      </w:r>
-    </w:p>
-    <w:p>
-      <w:pPr>
-        <w:spacing w:after="200" w:lineRule="auto"/>
-        <w:rPr>
-          <w:sz w:val="24"/>
-          <w:szCs w:val="24"/>
-        </w:rPr>
-      </w:pPr>
-      <w:r>
-        <w:rPr>
-          <w:sz w:val="24"/>
-          <w:szCs w:val="24"/>
-          <w:rtl w:val="0"/>
-        </w:rPr>
-        <w:t xml:space="preserve">Yeah no… no. That’s a dead end.</w:t>
-      </w:r>
-    </w:p>
-    <w:p>
-      <w:pPr>
-        <w:spacing w:after="200" w:lineRule="auto"/>
-        <w:rPr>
-          <w:sz w:val="24"/>
-          <w:szCs w:val="24"/>
-        </w:rPr>
-      </w:pPr>
-      <w:r>
-        <w:rPr>
-          <w:sz w:val="24"/>
-          <w:szCs w:val="24"/>
-          <w:rtl w:val="0"/>
-        </w:rPr>
-        <w:t xml:space="preserve">oh…ok….</w:t>
-      </w:r>
-    </w:p>
-    <w:p>
-      <w:pPr>
-        <w:spacing w:after="200" w:lineRule="auto"/>
-        <w:rPr>
-          <w:sz w:val="24"/>
-          <w:szCs w:val="24"/>
-        </w:rPr>
-      </w:pPr>
-      <w:r>
-        <w:rPr>
-          <w:sz w:val="24"/>
-          <w:szCs w:val="24"/>
-          <w:rtl w:val="0"/>
-        </w:rPr>
-        <w:t xml:space="preserve">Let’s go the other way.</w:t>
-      </w:r>
-    </w:p>
-    <w:p>
-      <w:pPr>
-        <w:spacing w:after="200" w:lineRule="auto"/>
-        <w:rPr>
-          <w:sz w:val="24"/>
-          <w:szCs w:val="24"/>
-        </w:rPr>
-      </w:pPr>
-      <w:r>
-        <w:rPr>
-          <w:sz w:val="24"/>
-          <w:szCs w:val="24"/>
-          <w:rtl w:val="0"/>
-        </w:rPr>
-        <w:t xml:space="preserve">So, you know, maybe it’s a bad time…</w:t>
-      </w:r>
-    </w:p>
-    <w:p>
-      <w:pPr>
-        <w:spacing w:after="200" w:lineRule="auto"/>
-        <w:rPr>
-          <w:sz w:val="24"/>
-          <w:szCs w:val="24"/>
-        </w:rPr>
-      </w:pPr>
-      <w:r>
-        <w:rPr>
-          <w:sz w:val="24"/>
-          <w:szCs w:val="24"/>
-          <w:rtl w:val="0"/>
-        </w:rPr>
-        <w:t xml:space="preserve">but do you like film? Cinema?</w:t>
-      </w:r>
-    </w:p>
-    <w:p>
-      <w:pPr>
-        <w:spacing w:after="200" w:lineRule="auto"/>
-        <w:rPr>
-          <w:sz w:val="24"/>
-          <w:szCs w:val="24"/>
-        </w:rPr>
-      </w:pPr>
-      <w:r>
-        <w:rPr>
-          <w:sz w:val="24"/>
-          <w:szCs w:val="24"/>
-          <w:rtl w:val="0"/>
-        </w:rPr>
-        <w:t xml:space="preserve">You know what? Yes. That is… That is a bad time.</w:t>
-      </w:r>
-    </w:p>
-    <w:p>
-      <w:pPr>
-        <w:spacing w:after="200" w:lineRule="auto"/>
-        <w:rPr>
-          <w:sz w:val="24"/>
-          <w:szCs w:val="24"/>
-        </w:rPr>
-      </w:pPr>
       <w:commentRangeStart w:id="5"/>
       <w:commentRangeStart w:id="6"/>
-      <w:commentRangeStart w:id="7"/>
       <w:r>
         <w:rPr>
           <w:sz w:val="24"/>
@@ -10897,6 +11022,10 @@
         </w:rPr>
         <w:t xml:space="preserve">Wait! Paul, Here! Let’s go to those trashcans!</w:t>
       </w:r>
+      <w:commentRangeEnd w:id="4"/>
+      <w:r>
+        <w:commentReference w:id="4"/>
+      </w:r>
       <w:commentRangeEnd w:id="5"/>
       <w:r>
         <w:commentReference w:id="5"/>
@@ -10905,10 +11034,6 @@
       <w:r>
         <w:commentReference w:id="6"/>
       </w:r>
-      <w:commentRangeEnd w:id="7"/>
-      <w:r>
-        <w:commentReference w:id="7"/>
-      </w:r>
       <w:r>
         <w:rPr>
           <w:rtl w:val="0"/>
@@ -11598,7 +11723,7 @@
           <w:szCs w:val="24"/>
           <w:rtl w:val="0"/>
         </w:rPr>
-        <w:t xml:space="preserve">(---)</w:t>
+        <w:t xml:space="preserve">[blank]</w:t>
       </w:r>
     </w:p>
     <w:p>
@@ -15770,7 +15895,7 @@
           <w:szCs w:val="24"/>
           <w:rtl w:val="0"/>
         </w:rPr>
-        <w:t xml:space="preserve">—--</w:t>
+        <w:t xml:space="preserve">[blank]</w:t>
       </w:r>
     </w:p>
     <w:p>
@@ -16314,7 +16439,7 @@
           <w:szCs w:val="24"/>
           <w:rtl w:val="0"/>
         </w:rPr>
-        <w:t xml:space="preserve">Why the fuck did I come back here?</w:t>
+        <w:t xml:space="preserve">Why did I come back here?</w:t>
       </w:r>
     </w:p>
     <w:p>
@@ -16563,7 +16688,7 @@
           <w:szCs w:val="24"/>
         </w:rPr>
       </w:pPr>
-      <w:commentRangeStart w:id="8"/>
+      <w:commentRangeStart w:id="7"/>
       <w:r>
         <w:rPr>
           <w:sz w:val="24"/>
@@ -16572,9 +16697,9 @@
         </w:rPr>
         <w:t xml:space="preserve">Couch surfing</w:t>
       </w:r>
-      <w:commentRangeEnd w:id="8"/>
-      <w:r>
-        <w:commentReference w:id="8"/>
+      <w:commentRangeEnd w:id="7"/>
+      <w:r>
+        <w:commentReference w:id="7"/>
       </w:r>
       <w:r>
         <w:rPr>
@@ -17876,7 +18001,7 @@
           <w:szCs w:val="24"/>
           <w:rtl w:val="0"/>
         </w:rPr>
-        <w:t xml:space="preserve">[E6]</w:t>
+        <w:t xml:space="preserve">[blank]</w:t>
       </w:r>
     </w:p>
     <w:p>
@@ -18297,8 +18422,8 @@
           <w:szCs w:val="24"/>
         </w:rPr>
       </w:pPr>
+      <w:commentRangeStart w:id="8"/>
       <w:commentRangeStart w:id="9"/>
-      <w:commentRangeStart w:id="10"/>
       <w:r>
         <w:rPr>
           <w:sz w:val="24"/>
@@ -18377,13 +18502,13 @@
         <w:br w:type="textWrapping"/>
         <w:t xml:space="preserve">I love you too sweetie.</w:t>
       </w:r>
+      <w:commentRangeEnd w:id="8"/>
+      <w:r>
+        <w:commentReference w:id="8"/>
+      </w:r>
       <w:commentRangeEnd w:id="9"/>
       <w:r>
         <w:commentReference w:id="9"/>
-      </w:r>
-      <w:commentRangeEnd w:id="10"/>
-      <w:r>
-        <w:commentReference w:id="10"/>
       </w:r>
       <w:r>
         <w:rPr>
@@ -18456,7 +18581,7 @@
           <w:szCs w:val="24"/>
         </w:rPr>
       </w:pPr>
-      <w:commentRangeStart w:id="11"/>
+      <w:commentRangeStart w:id="10"/>
       <w:r>
         <w:rPr>
           <w:sz w:val="24"/>
@@ -18482,9 +18607,9 @@
         </w:rPr>
         <w:t xml:space="preserve">She’s locked herself in the choir room…</w:t>
       </w:r>
-      <w:commentRangeEnd w:id="11"/>
-      <w:r>
-        <w:commentReference w:id="11"/>
+      <w:commentRangeEnd w:id="10"/>
+      <w:r>
+        <w:commentReference w:id="10"/>
       </w:r>
       <w:r>
         <w:rPr>
@@ -18974,442 +19099,442 @@
         </w:rPr>
         <w:t xml:space="preserve">Which is why I’m gonna go with you to </w:t>
       </w:r>
+      <w:commentRangeStart w:id="11"/>
+      <w:r>
+        <w:rPr>
+          <w:sz w:val="24"/>
+          <w:szCs w:val="24"/>
+          <w:rtl w:val="0"/>
+        </w:rPr>
+        <w:t xml:space="preserve">bring your daughter back.</w:t>
+      </w:r>
+      <w:commentRangeEnd w:id="11"/>
+      <w:r>
+        <w:commentReference w:id="11"/>
+      </w:r>
+      <w:r>
+        <w:rPr>
+          <w:rtl w:val="0"/>
+        </w:rPr>
+      </w:r>
+    </w:p>
+    <w:p>
+      <w:pPr>
+        <w:spacing w:after="200" w:lineRule="auto"/>
+        <w:rPr>
+          <w:sz w:val="24"/>
+          <w:szCs w:val="24"/>
+        </w:rPr>
+      </w:pPr>
+      <w:r>
+        <w:rPr>
+          <w:sz w:val="24"/>
+          <w:szCs w:val="24"/>
+          <w:rtl w:val="0"/>
+        </w:rPr>
+        <w:t xml:space="preserve">Paul, you’d do that for me?</w:t>
+      </w:r>
+    </w:p>
+    <w:p>
+      <w:pPr>
+        <w:spacing w:after="200" w:lineRule="auto"/>
+        <w:rPr>
+          <w:sz w:val="24"/>
+          <w:szCs w:val="24"/>
+        </w:rPr>
+      </w:pPr>
+      <w:r>
+        <w:rPr>
+          <w:sz w:val="24"/>
+          <w:szCs w:val="24"/>
+          <w:rtl w:val="0"/>
+        </w:rPr>
+        <w:t xml:space="preserve">Hey. It’s not like you’re asking me to go see ‘Mama Mia.’</w:t>
+      </w:r>
+    </w:p>
+    <w:p>
+      <w:pPr>
+        <w:spacing w:after="200" w:lineRule="auto"/>
+        <w:rPr>
+          <w:sz w:val="24"/>
+          <w:szCs w:val="24"/>
+        </w:rPr>
+      </w:pPr>
+      <w:r>
+        <w:rPr>
+          <w:sz w:val="24"/>
+          <w:szCs w:val="24"/>
+          <w:rtl w:val="0"/>
+        </w:rPr>
+        <w:t xml:space="preserve">Okay. Let’s go! In and out twenty minutes adventure.</w:t>
+      </w:r>
+    </w:p>
+    <w:p>
+      <w:pPr>
+        <w:spacing w:after="200" w:lineRule="auto"/>
+        <w:rPr>
+          <w:sz w:val="24"/>
+          <w:szCs w:val="24"/>
+        </w:rPr>
+      </w:pPr>
+      <w:r>
+        <w:rPr>
+          <w:sz w:val="24"/>
+          <w:szCs w:val="24"/>
+          <w:rtl w:val="0"/>
+        </w:rPr>
+        <w:t xml:space="preserve">No, Emma, stay here. I have a theory of how these aliens can be stopped,</w:t>
+      </w:r>
+    </w:p>
+    <w:p>
+      <w:pPr>
+        <w:spacing w:after="200" w:lineRule="auto"/>
+        <w:rPr>
+          <w:sz w:val="24"/>
+          <w:szCs w:val="24"/>
+        </w:rPr>
+      </w:pPr>
+      <w:r>
+        <w:rPr>
+          <w:sz w:val="24"/>
+          <w:szCs w:val="24"/>
+          <w:rtl w:val="0"/>
+        </w:rPr>
+        <w:t xml:space="preserve">but I’ll need an extra pair of hands in the lab.</w:t>
+      </w:r>
+    </w:p>
+    <w:p>
+      <w:pPr>
+        <w:spacing w:after="200" w:lineRule="auto"/>
+        <w:rPr>
+          <w:sz w:val="24"/>
+          <w:szCs w:val="24"/>
+        </w:rPr>
+      </w:pPr>
+      <w:r>
+        <w:rPr>
+          <w:sz w:val="24"/>
+          <w:szCs w:val="24"/>
+          <w:rtl w:val="0"/>
+        </w:rPr>
+        <w:t xml:space="preserve">Paul. Bill. Godspeed.</w:t>
+      </w:r>
+    </w:p>
+    <w:p>
+      <w:pPr>
+        <w:spacing w:after="200" w:lineRule="auto"/>
+        <w:rPr>
+          <w:sz w:val="24"/>
+          <w:szCs w:val="24"/>
+        </w:rPr>
+      </w:pPr>
+      <w:r>
+        <w:rPr>
+          <w:sz w:val="24"/>
+          <w:szCs w:val="24"/>
+          <w:rtl w:val="0"/>
+        </w:rPr>
+        <w:t xml:space="preserve">Hey Paul, listen… If those things get you, </w:t>
+      </w:r>
+    </w:p>
+    <w:p>
+      <w:pPr>
+        <w:spacing w:after="200" w:lineRule="auto"/>
+        <w:rPr>
+          <w:sz w:val="24"/>
+          <w:szCs w:val="24"/>
+        </w:rPr>
+      </w:pPr>
+      <w:r>
+        <w:rPr>
+          <w:sz w:val="24"/>
+          <w:szCs w:val="24"/>
+          <w:rtl w:val="0"/>
+        </w:rPr>
+        <w:t xml:space="preserve">they’re gonna make you sing, and dance, </w:t>
+      </w:r>
+    </w:p>
+    <w:p>
+      <w:pPr>
+        <w:spacing w:after="200" w:lineRule="auto"/>
+        <w:rPr>
+          <w:sz w:val="24"/>
+          <w:szCs w:val="24"/>
+        </w:rPr>
+      </w:pPr>
+      <w:r>
+        <w:rPr>
+          <w:sz w:val="24"/>
+          <w:szCs w:val="24"/>
+          <w:rtl w:val="0"/>
+        </w:rPr>
+        <w:t xml:space="preserve">and do all that shit you hate… so don’t you let ‘em.</w:t>
+      </w:r>
+    </w:p>
+    <w:p>
+      <w:pPr>
+        <w:spacing w:after="200" w:lineRule="auto"/>
+        <w:rPr>
+          <w:sz w:val="24"/>
+          <w:szCs w:val="24"/>
+        </w:rPr>
+      </w:pPr>
+      <w:r>
+        <w:rPr>
+          <w:sz w:val="24"/>
+          <w:szCs w:val="24"/>
+          <w:rtl w:val="0"/>
+        </w:rPr>
+        <w:t xml:space="preserve">Emma, there comes a time in every man’s life </w:t>
+      </w:r>
+    </w:p>
+    <w:p>
+      <w:pPr>
+        <w:spacing w:after="200" w:lineRule="auto"/>
+        <w:rPr>
+          <w:sz w:val="24"/>
+          <w:szCs w:val="24"/>
+        </w:rPr>
+      </w:pPr>
+      <w:r>
+        <w:rPr>
+          <w:sz w:val="24"/>
+          <w:szCs w:val="24"/>
+          <w:rtl w:val="0"/>
+        </w:rPr>
+        <w:t xml:space="preserve">when he has to draw a line in the sand.</w:t>
+      </w:r>
+    </w:p>
+    <w:p>
+      <w:pPr>
+        <w:spacing w:after="200" w:lineRule="auto"/>
+        <w:rPr>
+          <w:sz w:val="24"/>
+          <w:szCs w:val="24"/>
+        </w:rPr>
+      </w:pPr>
+      <w:r>
+        <w:rPr>
+          <w:sz w:val="24"/>
+          <w:szCs w:val="24"/>
+          <w:rtl w:val="0"/>
+        </w:rPr>
+        <w:t xml:space="preserve">And I will never be in a fucking musical.</w:t>
+      </w:r>
+    </w:p>
+    <w:p>
+      <w:pPr>
+        <w:spacing w:after="200" w:lineRule="auto"/>
+        <w:rPr>
+          <w:sz w:val="24"/>
+          <w:szCs w:val="24"/>
+        </w:rPr>
+      </w:pPr>
+      <w:r>
+        <w:rPr>
+          <w:sz w:val="24"/>
+          <w:szCs w:val="24"/>
+          <w:rtl w:val="0"/>
+        </w:rPr>
+        <w:t xml:space="preserve">[INTERMISSION]</w:t>
+      </w:r>
+    </w:p>
+    <w:p>
+      <w:pPr>
+        <w:spacing w:after="200" w:lineRule="auto"/>
+        <w:rPr>
+          <w:sz w:val="24"/>
+          <w:szCs w:val="24"/>
+        </w:rPr>
+      </w:pPr>
+      <w:r>
+        <w:rPr>
+          <w:sz w:val="24"/>
+          <w:szCs w:val="24"/>
+          <w:rtl w:val="0"/>
+        </w:rPr>
+        <w:t xml:space="preserve">Alice?! Alice?!? Sweetie Where are you?!?</w:t>
+      </w:r>
+    </w:p>
+    <w:p>
+      <w:pPr>
+        <w:spacing w:after="200" w:lineRule="auto"/>
+        <w:rPr>
+          <w:sz w:val="24"/>
+          <w:szCs w:val="24"/>
+        </w:rPr>
+      </w:pPr>
+      <w:r>
+        <w:rPr>
+          <w:sz w:val="24"/>
+          <w:szCs w:val="24"/>
+          <w:rtl w:val="0"/>
+        </w:rPr>
+        <w:t xml:space="preserve">Bill! Be quiet!</w:t>
+      </w:r>
+    </w:p>
+    <w:p>
+      <w:pPr>
+        <w:spacing w:after="200" w:lineRule="auto"/>
+        <w:rPr>
+          <w:sz w:val="24"/>
+          <w:szCs w:val="24"/>
+        </w:rPr>
+      </w:pPr>
+      <w:r>
+        <w:rPr>
+          <w:sz w:val="24"/>
+          <w:szCs w:val="24"/>
+          <w:rtl w:val="0"/>
+        </w:rPr>
+        <w:t xml:space="preserve">We gotta find her, Paul!</w:t>
+      </w:r>
+    </w:p>
+    <w:p>
+      <w:pPr>
+        <w:spacing w:after="200" w:lineRule="auto"/>
+        <w:rPr>
+          <w:sz w:val="24"/>
+          <w:szCs w:val="24"/>
+        </w:rPr>
+      </w:pPr>
+      <w:r>
+        <w:rPr>
+          <w:sz w:val="24"/>
+          <w:szCs w:val="24"/>
+          <w:rtl w:val="0"/>
+        </w:rPr>
+        <w:t xml:space="preserve">We will, but you have to shut up. </w:t>
+      </w:r>
+    </w:p>
+    <w:p>
+      <w:pPr>
+        <w:spacing w:after="200" w:lineRule="auto"/>
+        <w:rPr>
+          <w:sz w:val="24"/>
+          <w:szCs w:val="24"/>
+        </w:rPr>
+      </w:pPr>
+      <w:r>
+        <w:rPr>
+          <w:sz w:val="24"/>
+          <w:szCs w:val="24"/>
+          <w:rtl w:val="0"/>
+        </w:rPr>
+        <w:t xml:space="preserve">This place could be crawling with those… things! </w:t>
+      </w:r>
+    </w:p>
+    <w:p>
+      <w:pPr>
+        <w:spacing w:after="200" w:lineRule="auto"/>
+        <w:rPr>
+          <w:sz w:val="24"/>
+          <w:szCs w:val="24"/>
+        </w:rPr>
+      </w:pPr>
+      <w:r>
+        <w:rPr>
+          <w:sz w:val="24"/>
+          <w:szCs w:val="24"/>
+          <w:rtl w:val="0"/>
+        </w:rPr>
+        <w:t xml:space="preserve">You screaming is gonna get us killed, </w:t>
+      </w:r>
+    </w:p>
+    <w:p>
+      <w:pPr>
+        <w:spacing w:after="200" w:lineRule="auto"/>
+        <w:rPr>
+          <w:sz w:val="24"/>
+          <w:szCs w:val="24"/>
+        </w:rPr>
+      </w:pPr>
+      <w:r>
+        <w:rPr>
+          <w:sz w:val="24"/>
+          <w:szCs w:val="24"/>
+          <w:rtl w:val="0"/>
+        </w:rPr>
+        <w:t xml:space="preserve">and then who’s gonna save Alice?</w:t>
+      </w:r>
+    </w:p>
+    <w:p>
+      <w:pPr>
+        <w:spacing w:after="200" w:lineRule="auto"/>
+        <w:rPr>
+          <w:sz w:val="24"/>
+          <w:szCs w:val="24"/>
+        </w:rPr>
+      </w:pPr>
+      <w:r>
+        <w:rPr>
+          <w:sz w:val="24"/>
+          <w:szCs w:val="24"/>
+          <w:rtl w:val="0"/>
+        </w:rPr>
+        <w:t xml:space="preserve">Right. Right. Sorry, Paul. It’s just… she’s all I have.</w:t>
+      </w:r>
+    </w:p>
+    <w:p>
+      <w:pPr>
+        <w:spacing w:after="200" w:lineRule="auto"/>
+        <w:rPr>
+          <w:sz w:val="24"/>
+          <w:szCs w:val="24"/>
+        </w:rPr>
+      </w:pPr>
+      <w:r>
+        <w:rPr>
+          <w:sz w:val="24"/>
+          <w:szCs w:val="24"/>
+          <w:rtl w:val="0"/>
+        </w:rPr>
+        <w:t xml:space="preserve">I know. Just try to stay calm and follow me.</w:t>
+      </w:r>
+    </w:p>
+    <w:p>
+      <w:pPr>
+        <w:spacing w:after="200" w:lineRule="auto"/>
+        <w:rPr>
+          <w:sz w:val="24"/>
+          <w:szCs w:val="24"/>
+        </w:rPr>
+      </w:pPr>
+      <w:r>
+        <w:rPr>
+          <w:sz w:val="24"/>
+          <w:szCs w:val="24"/>
+          <w:rtl w:val="0"/>
+        </w:rPr>
+        <w:t xml:space="preserve">Ok.</w:t>
+      </w:r>
+    </w:p>
+    <w:p>
+      <w:pPr>
+        <w:spacing w:after="200" w:lineRule="auto"/>
+        <w:rPr>
+          <w:sz w:val="24"/>
+          <w:szCs w:val="24"/>
+        </w:rPr>
+      </w:pPr>
+      <w:r>
+        <w:rPr>
+          <w:sz w:val="24"/>
+          <w:szCs w:val="24"/>
+          <w:rtl w:val="0"/>
+        </w:rPr>
+        <w:t xml:space="preserve">Jesus! Could you point that someplace else?</w:t>
+      </w:r>
+    </w:p>
+    <w:p>
+      <w:pPr>
+        <w:spacing w:after="200" w:lineRule="auto"/>
+        <w:rPr>
+          <w:sz w:val="24"/>
+          <w:szCs w:val="24"/>
+        </w:rPr>
+      </w:pPr>
       <w:commentRangeStart w:id="12"/>
-      <w:r>
-        <w:rPr>
-          <w:sz w:val="24"/>
-          <w:szCs w:val="24"/>
-          <w:rtl w:val="0"/>
-        </w:rPr>
-        <w:t xml:space="preserve">bring your daughter back.</w:t>
-      </w:r>
-      <w:commentRangeEnd w:id="12"/>
-      <w:r>
-        <w:commentReference w:id="12"/>
-      </w:r>
-      <w:r>
-        <w:rPr>
-          <w:rtl w:val="0"/>
-        </w:rPr>
-      </w:r>
-    </w:p>
-    <w:p>
-      <w:pPr>
-        <w:spacing w:after="200" w:lineRule="auto"/>
-        <w:rPr>
-          <w:sz w:val="24"/>
-          <w:szCs w:val="24"/>
-        </w:rPr>
-      </w:pPr>
-      <w:r>
-        <w:rPr>
-          <w:sz w:val="24"/>
-          <w:szCs w:val="24"/>
-          <w:rtl w:val="0"/>
-        </w:rPr>
-        <w:t xml:space="preserve">Paul, you’d do that for me?</w:t>
-      </w:r>
-    </w:p>
-    <w:p>
-      <w:pPr>
-        <w:spacing w:after="200" w:lineRule="auto"/>
-        <w:rPr>
-          <w:sz w:val="24"/>
-          <w:szCs w:val="24"/>
-        </w:rPr>
-      </w:pPr>
-      <w:r>
-        <w:rPr>
-          <w:sz w:val="24"/>
-          <w:szCs w:val="24"/>
-          <w:rtl w:val="0"/>
-        </w:rPr>
-        <w:t xml:space="preserve">Hey. It’s not like you’re asking me to go see ‘Mama Mia.’</w:t>
-      </w:r>
-    </w:p>
-    <w:p>
-      <w:pPr>
-        <w:spacing w:after="200" w:lineRule="auto"/>
-        <w:rPr>
-          <w:sz w:val="24"/>
-          <w:szCs w:val="24"/>
-        </w:rPr>
-      </w:pPr>
-      <w:r>
-        <w:rPr>
-          <w:sz w:val="24"/>
-          <w:szCs w:val="24"/>
-          <w:rtl w:val="0"/>
-        </w:rPr>
-        <w:t xml:space="preserve">Okay. Let’s go! In and out twenty minutes adventure.</w:t>
-      </w:r>
-    </w:p>
-    <w:p>
-      <w:pPr>
-        <w:spacing w:after="200" w:lineRule="auto"/>
-        <w:rPr>
-          <w:sz w:val="24"/>
-          <w:szCs w:val="24"/>
-        </w:rPr>
-      </w:pPr>
-      <w:r>
-        <w:rPr>
-          <w:sz w:val="24"/>
-          <w:szCs w:val="24"/>
-          <w:rtl w:val="0"/>
-        </w:rPr>
-        <w:t xml:space="preserve">No, Emma, stay here. I have a theory of how these aliens can be stopped,</w:t>
-      </w:r>
-    </w:p>
-    <w:p>
-      <w:pPr>
-        <w:spacing w:after="200" w:lineRule="auto"/>
-        <w:rPr>
-          <w:sz w:val="24"/>
-          <w:szCs w:val="24"/>
-        </w:rPr>
-      </w:pPr>
-      <w:r>
-        <w:rPr>
-          <w:sz w:val="24"/>
-          <w:szCs w:val="24"/>
-          <w:rtl w:val="0"/>
-        </w:rPr>
-        <w:t xml:space="preserve">but I’ll need an extra pair of hands in the lab.</w:t>
-      </w:r>
-    </w:p>
-    <w:p>
-      <w:pPr>
-        <w:spacing w:after="200" w:lineRule="auto"/>
-        <w:rPr>
-          <w:sz w:val="24"/>
-          <w:szCs w:val="24"/>
-        </w:rPr>
-      </w:pPr>
-      <w:r>
-        <w:rPr>
-          <w:sz w:val="24"/>
-          <w:szCs w:val="24"/>
-          <w:rtl w:val="0"/>
-        </w:rPr>
-        <w:t xml:space="preserve">Paul. Bill. Godspeed.</w:t>
-      </w:r>
-    </w:p>
-    <w:p>
-      <w:pPr>
-        <w:spacing w:after="200" w:lineRule="auto"/>
-        <w:rPr>
-          <w:sz w:val="24"/>
-          <w:szCs w:val="24"/>
-        </w:rPr>
-      </w:pPr>
-      <w:r>
-        <w:rPr>
-          <w:sz w:val="24"/>
-          <w:szCs w:val="24"/>
-          <w:rtl w:val="0"/>
-        </w:rPr>
-        <w:t xml:space="preserve">Hey Paul, listen… If those things get you, </w:t>
-      </w:r>
-    </w:p>
-    <w:p>
-      <w:pPr>
-        <w:spacing w:after="200" w:lineRule="auto"/>
-        <w:rPr>
-          <w:sz w:val="24"/>
-          <w:szCs w:val="24"/>
-        </w:rPr>
-      </w:pPr>
-      <w:r>
-        <w:rPr>
-          <w:sz w:val="24"/>
-          <w:szCs w:val="24"/>
-          <w:rtl w:val="0"/>
-        </w:rPr>
-        <w:t xml:space="preserve">they’re gonna make you sing, and dance, </w:t>
-      </w:r>
-    </w:p>
-    <w:p>
-      <w:pPr>
-        <w:spacing w:after="200" w:lineRule="auto"/>
-        <w:rPr>
-          <w:sz w:val="24"/>
-          <w:szCs w:val="24"/>
-        </w:rPr>
-      </w:pPr>
-      <w:r>
-        <w:rPr>
-          <w:sz w:val="24"/>
-          <w:szCs w:val="24"/>
-          <w:rtl w:val="0"/>
-        </w:rPr>
-        <w:t xml:space="preserve">and do all that shit you hate… so don’t you let ‘em.</w:t>
-      </w:r>
-    </w:p>
-    <w:p>
-      <w:pPr>
-        <w:spacing w:after="200" w:lineRule="auto"/>
-        <w:rPr>
-          <w:sz w:val="24"/>
-          <w:szCs w:val="24"/>
-        </w:rPr>
-      </w:pPr>
-      <w:r>
-        <w:rPr>
-          <w:sz w:val="24"/>
-          <w:szCs w:val="24"/>
-          <w:rtl w:val="0"/>
-        </w:rPr>
-        <w:t xml:space="preserve">Emma, there comes a time in every man’s life </w:t>
-      </w:r>
-    </w:p>
-    <w:p>
-      <w:pPr>
-        <w:spacing w:after="200" w:lineRule="auto"/>
-        <w:rPr>
-          <w:sz w:val="24"/>
-          <w:szCs w:val="24"/>
-        </w:rPr>
-      </w:pPr>
-      <w:r>
-        <w:rPr>
-          <w:sz w:val="24"/>
-          <w:szCs w:val="24"/>
-          <w:rtl w:val="0"/>
-        </w:rPr>
-        <w:t xml:space="preserve">when he has to draw a line in the sand.</w:t>
-      </w:r>
-    </w:p>
-    <w:p>
-      <w:pPr>
-        <w:spacing w:after="200" w:lineRule="auto"/>
-        <w:rPr>
-          <w:sz w:val="24"/>
-          <w:szCs w:val="24"/>
-        </w:rPr>
-      </w:pPr>
-      <w:r>
-        <w:rPr>
-          <w:sz w:val="24"/>
-          <w:szCs w:val="24"/>
-          <w:rtl w:val="0"/>
-        </w:rPr>
-        <w:t xml:space="preserve">And I will never be in a fucking musical.</w:t>
-      </w:r>
-    </w:p>
-    <w:p>
-      <w:pPr>
-        <w:spacing w:after="200" w:lineRule="auto"/>
-        <w:rPr>
-          <w:sz w:val="24"/>
-          <w:szCs w:val="24"/>
-        </w:rPr>
-      </w:pPr>
-      <w:r>
-        <w:rPr>
-          <w:sz w:val="24"/>
-          <w:szCs w:val="24"/>
-          <w:rtl w:val="0"/>
-        </w:rPr>
-        <w:t xml:space="preserve">[INTERMISSION]</w:t>
-      </w:r>
-    </w:p>
-    <w:p>
-      <w:pPr>
-        <w:spacing w:after="200" w:lineRule="auto"/>
-        <w:rPr>
-          <w:sz w:val="24"/>
-          <w:szCs w:val="24"/>
-        </w:rPr>
-      </w:pPr>
-      <w:r>
-        <w:rPr>
-          <w:sz w:val="24"/>
-          <w:szCs w:val="24"/>
-          <w:rtl w:val="0"/>
-        </w:rPr>
-        <w:t xml:space="preserve">Alice?! Alice?!? Sweetie Where are you?!?</w:t>
-      </w:r>
-    </w:p>
-    <w:p>
-      <w:pPr>
-        <w:spacing w:after="200" w:lineRule="auto"/>
-        <w:rPr>
-          <w:sz w:val="24"/>
-          <w:szCs w:val="24"/>
-        </w:rPr>
-      </w:pPr>
-      <w:r>
-        <w:rPr>
-          <w:sz w:val="24"/>
-          <w:szCs w:val="24"/>
-          <w:rtl w:val="0"/>
-        </w:rPr>
-        <w:t xml:space="preserve">Bill! Be quiet!</w:t>
-      </w:r>
-    </w:p>
-    <w:p>
-      <w:pPr>
-        <w:spacing w:after="200" w:lineRule="auto"/>
-        <w:rPr>
-          <w:sz w:val="24"/>
-          <w:szCs w:val="24"/>
-        </w:rPr>
-      </w:pPr>
-      <w:r>
-        <w:rPr>
-          <w:sz w:val="24"/>
-          <w:szCs w:val="24"/>
-          <w:rtl w:val="0"/>
-        </w:rPr>
-        <w:t xml:space="preserve">We gotta find her, Paul!</w:t>
-      </w:r>
-    </w:p>
-    <w:p>
-      <w:pPr>
-        <w:spacing w:after="200" w:lineRule="auto"/>
-        <w:rPr>
-          <w:sz w:val="24"/>
-          <w:szCs w:val="24"/>
-        </w:rPr>
-      </w:pPr>
-      <w:r>
-        <w:rPr>
-          <w:sz w:val="24"/>
-          <w:szCs w:val="24"/>
-          <w:rtl w:val="0"/>
-        </w:rPr>
-        <w:t xml:space="preserve">We will, but you have to shut up. </w:t>
-      </w:r>
-    </w:p>
-    <w:p>
-      <w:pPr>
-        <w:spacing w:after="200" w:lineRule="auto"/>
-        <w:rPr>
-          <w:sz w:val="24"/>
-          <w:szCs w:val="24"/>
-        </w:rPr>
-      </w:pPr>
-      <w:r>
-        <w:rPr>
-          <w:sz w:val="24"/>
-          <w:szCs w:val="24"/>
-          <w:rtl w:val="0"/>
-        </w:rPr>
-        <w:t xml:space="preserve">This place could be crawling with those… things! </w:t>
-      </w:r>
-    </w:p>
-    <w:p>
-      <w:pPr>
-        <w:spacing w:after="200" w:lineRule="auto"/>
-        <w:rPr>
-          <w:sz w:val="24"/>
-          <w:szCs w:val="24"/>
-        </w:rPr>
-      </w:pPr>
-      <w:r>
-        <w:rPr>
-          <w:sz w:val="24"/>
-          <w:szCs w:val="24"/>
-          <w:rtl w:val="0"/>
-        </w:rPr>
-        <w:t xml:space="preserve">You screaming is gonna get us killed, </w:t>
-      </w:r>
-    </w:p>
-    <w:p>
-      <w:pPr>
-        <w:spacing w:after="200" w:lineRule="auto"/>
-        <w:rPr>
-          <w:sz w:val="24"/>
-          <w:szCs w:val="24"/>
-        </w:rPr>
-      </w:pPr>
-      <w:r>
-        <w:rPr>
-          <w:sz w:val="24"/>
-          <w:szCs w:val="24"/>
-          <w:rtl w:val="0"/>
-        </w:rPr>
-        <w:t xml:space="preserve">and then who’s gonna save Alice?</w:t>
-      </w:r>
-    </w:p>
-    <w:p>
-      <w:pPr>
-        <w:spacing w:after="200" w:lineRule="auto"/>
-        <w:rPr>
-          <w:sz w:val="24"/>
-          <w:szCs w:val="24"/>
-        </w:rPr>
-      </w:pPr>
-      <w:r>
-        <w:rPr>
-          <w:sz w:val="24"/>
-          <w:szCs w:val="24"/>
-          <w:rtl w:val="0"/>
-        </w:rPr>
-        <w:t xml:space="preserve">Right. Right. Sorry, Paul. It’s just… she’s all I have.</w:t>
-      </w:r>
-    </w:p>
-    <w:p>
-      <w:pPr>
-        <w:spacing w:after="200" w:lineRule="auto"/>
-        <w:rPr>
-          <w:sz w:val="24"/>
-          <w:szCs w:val="24"/>
-        </w:rPr>
-      </w:pPr>
-      <w:r>
-        <w:rPr>
-          <w:sz w:val="24"/>
-          <w:szCs w:val="24"/>
-          <w:rtl w:val="0"/>
-        </w:rPr>
-        <w:t xml:space="preserve">I know. Just try to stay calm and follow me.</w:t>
-      </w:r>
-    </w:p>
-    <w:p>
-      <w:pPr>
-        <w:spacing w:after="200" w:lineRule="auto"/>
-        <w:rPr>
-          <w:sz w:val="24"/>
-          <w:szCs w:val="24"/>
-        </w:rPr>
-      </w:pPr>
-      <w:r>
-        <w:rPr>
-          <w:sz w:val="24"/>
-          <w:szCs w:val="24"/>
-          <w:rtl w:val="0"/>
-        </w:rPr>
-        <w:t xml:space="preserve">Ok.</w:t>
-      </w:r>
-    </w:p>
-    <w:p>
-      <w:pPr>
-        <w:spacing w:after="200" w:lineRule="auto"/>
-        <w:rPr>
-          <w:sz w:val="24"/>
-          <w:szCs w:val="24"/>
-        </w:rPr>
-      </w:pPr>
-      <w:r>
-        <w:rPr>
-          <w:sz w:val="24"/>
-          <w:szCs w:val="24"/>
-          <w:rtl w:val="0"/>
-        </w:rPr>
-        <w:t xml:space="preserve">Jesus! Could you point that someplace else?</w:t>
-      </w:r>
-    </w:p>
-    <w:p>
-      <w:pPr>
-        <w:spacing w:after="200" w:lineRule="auto"/>
-        <w:rPr>
-          <w:sz w:val="24"/>
-          <w:szCs w:val="24"/>
-        </w:rPr>
-      </w:pPr>
-      <w:commentRangeStart w:id="13"/>
       <w:r>
         <w:rPr>
           <w:sz w:val="24"/>
@@ -19464,9 +19589,9 @@
         <w:br w:type="textWrapping"/>
         <w:t xml:space="preserve">I just think Alice could do so much better.</w:t>
       </w:r>
-      <w:commentRangeEnd w:id="13"/>
-      <w:r>
-        <w:commentReference w:id="13"/>
+      <w:commentRangeEnd w:id="12"/>
+      <w:r>
+        <w:commentReference w:id="12"/>
       </w:r>
       <w:r>
         <w:rPr>
@@ -19552,7 +19677,7 @@
         </w:rPr>
         <w:t xml:space="preserve">Heck! I think </w:t>
       </w:r>
-      <w:commentRangeStart w:id="14"/>
+      <w:commentRangeStart w:id="13"/>
       <w:r>
         <w:rPr>
           <w:sz w:val="24"/>
@@ -19578,9 +19703,9 @@
         </w:rPr>
         <w:t xml:space="preserve">Paul, I’m the reason she’s trapped here. Oh god, it’s my fault.</w:t>
       </w:r>
-      <w:commentRangeEnd w:id="14"/>
-      <w:r>
-        <w:commentReference w:id="14"/>
+      <w:commentRangeEnd w:id="13"/>
+      <w:r>
+        <w:commentReference w:id="13"/>
       </w:r>
       <w:r>
         <w:rPr>
@@ -20601,7 +20726,7 @@
         </w:rPr>
         <w:t xml:space="preserve">Bill, whatever you’re thinking, </w:t>
       </w:r>
-      <w:commentRangeStart w:id="15"/>
+      <w:commentRangeStart w:id="14"/>
       <w:r>
         <w:rPr>
           <w:sz w:val="24"/>
@@ -20610,9 +20735,9 @@
         </w:rPr>
         <w:t xml:space="preserve">don’t</w:t>
       </w:r>
-      <w:commentRangeEnd w:id="15"/>
-      <w:r>
-        <w:commentReference w:id="15"/>
+      <w:commentRangeEnd w:id="14"/>
+      <w:r>
+        <w:commentReference w:id="14"/>
       </w:r>
       <w:r>
         <w:rPr>
@@ -21149,7 +21274,7 @@
           <w:szCs w:val="24"/>
           <w:rtl w:val="0"/>
         </w:rPr>
-        <w:t xml:space="preserve">—-</w:t>
+        <w:t xml:space="preserve">[blank]</w:t>
       </w:r>
     </w:p>
     <w:p>
@@ -21389,6 +21514,70 @@
         </w:rPr>
         <w:t xml:space="preserve">And it </w:t>
       </w:r>
+      <w:commentRangeStart w:id="15"/>
+      <w:r>
+        <w:rPr>
+          <w:sz w:val="24"/>
+          <w:szCs w:val="24"/>
+          <w:rtl w:val="0"/>
+        </w:rPr>
+        <w:t xml:space="preserve">wants</w:t>
+      </w:r>
+      <w:commentRangeEnd w:id="15"/>
+      <w:r>
+        <w:commentReference w:id="15"/>
+      </w:r>
+      <w:r>
+        <w:rPr>
+          <w:sz w:val="24"/>
+          <w:szCs w:val="24"/>
+          <w:rtl w:val="0"/>
+        </w:rPr>
+        <w:t xml:space="preserve"> to kill us all so it can resurrect us as part of its shitty musical?</w:t>
+      </w:r>
+    </w:p>
+    <w:p>
+      <w:pPr>
+        <w:spacing w:after="200" w:lineRule="auto"/>
+        <w:rPr>
+          <w:sz w:val="24"/>
+          <w:szCs w:val="24"/>
+        </w:rPr>
+      </w:pPr>
+      <w:r>
+        <w:rPr>
+          <w:sz w:val="24"/>
+          <w:szCs w:val="24"/>
+          <w:rtl w:val="0"/>
+        </w:rPr>
+        <w:t xml:space="preserve">Yes, that’s one way of putting it.</w:t>
+      </w:r>
+    </w:p>
+    <w:p>
+      <w:pPr>
+        <w:spacing w:after="200" w:lineRule="auto"/>
+        <w:rPr>
+          <w:sz w:val="24"/>
+          <w:szCs w:val="24"/>
+        </w:rPr>
+      </w:pPr>
+      <w:r>
+        <w:rPr>
+          <w:sz w:val="24"/>
+          <w:szCs w:val="24"/>
+          <w:rtl w:val="0"/>
+        </w:rPr>
+        <w:t xml:space="preserve">But you could also say it’s uniting us in a common purpose.</w:t>
+      </w:r>
+    </w:p>
+    <w:p>
+      <w:pPr>
+        <w:spacing w:after="200" w:lineRule="auto"/>
+        <w:rPr>
+          <w:sz w:val="24"/>
+          <w:szCs w:val="24"/>
+        </w:rPr>
+      </w:pPr>
       <w:commentRangeStart w:id="16"/>
       <w:r>
         <w:rPr>
@@ -21396,7 +21585,7 @@
           <w:szCs w:val="24"/>
           <w:rtl w:val="0"/>
         </w:rPr>
-        <w:t xml:space="preserve">wants</w:t>
+        <w:t xml:space="preserve">Imagine</w:t>
       </w:r>
       <w:commentRangeEnd w:id="16"/>
       <w:r>
@@ -21408,51 +21597,229 @@
           <w:szCs w:val="24"/>
           <w:rtl w:val="0"/>
         </w:rPr>
-        <w:t xml:space="preserve"> to kill us all so it can resurrect us as part of its shitty musical?</w:t>
-      </w:r>
-    </w:p>
-    <w:p>
-      <w:pPr>
-        <w:spacing w:after="200" w:lineRule="auto"/>
-        <w:rPr>
-          <w:sz w:val="24"/>
-          <w:szCs w:val="24"/>
-        </w:rPr>
-      </w:pPr>
-      <w:r>
-        <w:rPr>
-          <w:sz w:val="24"/>
-          <w:szCs w:val="24"/>
-          <w:rtl w:val="0"/>
-        </w:rPr>
-        <w:t xml:space="preserve">Yes, that’s one way of putting it.</w:t>
-      </w:r>
-    </w:p>
-    <w:p>
-      <w:pPr>
-        <w:spacing w:after="200" w:lineRule="auto"/>
-        <w:rPr>
-          <w:sz w:val="24"/>
-          <w:szCs w:val="24"/>
-        </w:rPr>
-      </w:pPr>
-      <w:r>
-        <w:rPr>
-          <w:sz w:val="24"/>
-          <w:szCs w:val="24"/>
-          <w:rtl w:val="0"/>
-        </w:rPr>
-        <w:t xml:space="preserve">But you could also say it’s uniting us in a common purpose.</w:t>
-      </w:r>
-    </w:p>
-    <w:p>
-      <w:pPr>
-        <w:spacing w:after="200" w:lineRule="auto"/>
-        <w:rPr>
-          <w:sz w:val="24"/>
-          <w:szCs w:val="24"/>
-        </w:rPr>
-      </w:pPr>
+        <w:t xml:space="preserve"> if this entity did spread to the rest of the planet.</w:t>
+      </w:r>
+    </w:p>
+    <w:p>
+      <w:pPr>
+        <w:spacing w:after="200" w:lineRule="auto"/>
+        <w:rPr>
+          <w:sz w:val="24"/>
+          <w:szCs w:val="24"/>
+        </w:rPr>
+      </w:pPr>
+      <w:r>
+        <w:rPr>
+          <w:sz w:val="24"/>
+          <w:szCs w:val="24"/>
+          <w:rtl w:val="0"/>
+        </w:rPr>
+        <w:t xml:space="preserve">It might achieve what fifty thousand years </w:t>
+      </w:r>
+    </w:p>
+    <w:p>
+      <w:pPr>
+        <w:spacing w:after="200" w:lineRule="auto"/>
+        <w:rPr>
+          <w:sz w:val="24"/>
+          <w:szCs w:val="24"/>
+        </w:rPr>
+      </w:pPr>
+      <w:r>
+        <w:rPr>
+          <w:sz w:val="24"/>
+          <w:szCs w:val="24"/>
+          <w:rtl w:val="0"/>
+        </w:rPr>
+        <w:t xml:space="preserve">of human civilization never could… </w:t>
+      </w:r>
+    </w:p>
+    <w:p>
+      <w:pPr>
+        <w:spacing w:after="200" w:lineRule="auto"/>
+        <w:rPr>
+          <w:sz w:val="24"/>
+          <w:szCs w:val="24"/>
+        </w:rPr>
+      </w:pPr>
+      <w:r>
+        <w:rPr>
+          <w:sz w:val="24"/>
+          <w:szCs w:val="24"/>
+          <w:rtl w:val="0"/>
+        </w:rPr>
+        <w:t xml:space="preserve">World peace</w:t>
+      </w:r>
+    </w:p>
+    <w:p>
+      <w:pPr>
+        <w:spacing w:after="200" w:lineRule="auto"/>
+        <w:rPr>
+          <w:sz w:val="24"/>
+          <w:szCs w:val="24"/>
+        </w:rPr>
+      </w:pPr>
+      <w:r>
+        <w:rPr>
+          <w:sz w:val="24"/>
+          <w:szCs w:val="24"/>
+          <w:rtl w:val="0"/>
+        </w:rPr>
+        <w:t xml:space="preserve">Ok… so how do we stop it?</w:t>
+      </w:r>
+    </w:p>
+    <w:p>
+      <w:pPr>
+        <w:spacing w:after="200" w:lineRule="auto"/>
+        <w:rPr>
+          <w:sz w:val="24"/>
+          <w:szCs w:val="24"/>
+        </w:rPr>
+      </w:pPr>
+      <w:r>
+        <w:rPr>
+          <w:sz w:val="24"/>
+          <w:szCs w:val="24"/>
+          <w:rtl w:val="0"/>
+        </w:rPr>
+        <w:t xml:space="preserve">Yes, yes. Stop it. Of course…</w:t>
+      </w:r>
+    </w:p>
+    <w:p>
+      <w:pPr>
+        <w:spacing w:after="200" w:lineRule="auto"/>
+        <w:rPr>
+          <w:sz w:val="24"/>
+          <w:szCs w:val="24"/>
+        </w:rPr>
+      </w:pPr>
+      <w:r>
+        <w:rPr>
+          <w:sz w:val="24"/>
+          <w:szCs w:val="24"/>
+          <w:rtl w:val="0"/>
+        </w:rPr>
+        <w:t xml:space="preserve">This all started with the meteor. It’s conducting everything.</w:t>
+      </w:r>
+    </w:p>
+    <w:p>
+      <w:pPr>
+        <w:spacing w:after="200" w:lineRule="auto"/>
+        <w:rPr>
+          <w:sz w:val="24"/>
+          <w:szCs w:val="24"/>
+        </w:rPr>
+      </w:pPr>
+      <w:r>
+        <w:rPr>
+          <w:sz w:val="24"/>
+          <w:szCs w:val="24"/>
+          <w:rtl w:val="0"/>
+        </w:rPr>
+        <w:t xml:space="preserve">If we take it out, will all these things just… die?</w:t>
+      </w:r>
+    </w:p>
+    <w:p>
+      <w:pPr>
+        <w:spacing w:after="200" w:lineRule="auto"/>
+        <w:rPr>
+          <w:sz w:val="24"/>
+          <w:szCs w:val="24"/>
+        </w:rPr>
+      </w:pPr>
+      <w:r>
+        <w:rPr>
+          <w:sz w:val="24"/>
+          <w:szCs w:val="24"/>
+          <w:rtl w:val="0"/>
+        </w:rPr>
+        <w:t xml:space="preserve">That’s a sound theory… Which is why it must never leave this room!</w:t>
+      </w:r>
+    </w:p>
+    <w:p>
+      <w:pPr>
+        <w:spacing w:after="200" w:lineRule="auto"/>
+        <w:rPr>
+          <w:sz w:val="24"/>
+          <w:szCs w:val="24"/>
+        </w:rPr>
+      </w:pPr>
+      <w:r>
+        <w:rPr>
+          <w:sz w:val="24"/>
+          <w:szCs w:val="24"/>
+          <w:rtl w:val="0"/>
+        </w:rPr>
+        <w:t xml:space="preserve">What?</w:t>
+      </w:r>
+    </w:p>
+    <w:p>
+      <w:pPr>
+        <w:spacing w:after="200" w:lineRule="auto"/>
+        <w:rPr>
+          <w:sz w:val="24"/>
+          <w:szCs w:val="24"/>
+        </w:rPr>
+      </w:pPr>
+      <w:r>
+        <w:rPr>
+          <w:sz w:val="24"/>
+          <w:szCs w:val="24"/>
+          <w:rtl w:val="0"/>
+        </w:rPr>
+        <w:t xml:space="preserve">Shshhhhh… Don’t fight it, Emma. Don’t fight it.</w:t>
+      </w:r>
+    </w:p>
+    <w:p>
+      <w:pPr>
+        <w:spacing w:after="200" w:lineRule="auto"/>
+        <w:rPr>
+          <w:sz w:val="24"/>
+          <w:szCs w:val="24"/>
+        </w:rPr>
+      </w:pPr>
+      <w:r>
+        <w:rPr>
+          <w:sz w:val="24"/>
+          <w:szCs w:val="24"/>
+          <w:rtl w:val="0"/>
+        </w:rPr>
+        <w:t xml:space="preserve">[blank]</w:t>
+      </w:r>
+    </w:p>
+    <w:p>
+      <w:pPr>
+        <w:spacing w:after="200" w:lineRule="auto"/>
+        <w:rPr>
+          <w:sz w:val="24"/>
+          <w:szCs w:val="24"/>
+        </w:rPr>
+      </w:pPr>
+      <w:r>
+        <w:rPr>
+          <w:sz w:val="24"/>
+          <w:szCs w:val="24"/>
+          <w:rtl w:val="0"/>
+        </w:rPr>
+        <w:t xml:space="preserve">Sorry for that bump on the head, son. </w:t>
+      </w:r>
+    </w:p>
+    <w:p>
+      <w:pPr>
+        <w:spacing w:after="200" w:lineRule="auto"/>
+        <w:rPr>
+          <w:sz w:val="24"/>
+          <w:szCs w:val="24"/>
+        </w:rPr>
+      </w:pPr>
+      <w:r>
+        <w:rPr>
+          <w:sz w:val="24"/>
+          <w:szCs w:val="24"/>
+          <w:rtl w:val="0"/>
+        </w:rPr>
+        <w:t xml:space="preserve">You can never be too </w:t>
+      </w:r>
       <w:commentRangeStart w:id="17"/>
       <w:r>
         <w:rPr>
@@ -21460,7 +21827,7 @@
           <w:szCs w:val="24"/>
           <w:rtl w:val="0"/>
         </w:rPr>
-        <w:t xml:space="preserve">Imagine</w:t>
+        <w:t xml:space="preserve">careful</w:t>
       </w:r>
       <w:commentRangeEnd w:id="17"/>
       <w:r>
@@ -21472,248 +21839,6 @@
           <w:szCs w:val="24"/>
           <w:rtl w:val="0"/>
         </w:rPr>
-        <w:t xml:space="preserve"> if this entity did spread to the rest of the planet.</w:t>
-      </w:r>
-    </w:p>
-    <w:p>
-      <w:pPr>
-        <w:spacing w:after="200" w:lineRule="auto"/>
-        <w:rPr>
-          <w:sz w:val="24"/>
-          <w:szCs w:val="24"/>
-        </w:rPr>
-      </w:pPr>
-      <w:r>
-        <w:rPr>
-          <w:sz w:val="24"/>
-          <w:szCs w:val="24"/>
-          <w:rtl w:val="0"/>
-        </w:rPr>
-        <w:t xml:space="preserve">It might achieve what fifty thousand years </w:t>
-      </w:r>
-    </w:p>
-    <w:p>
-      <w:pPr>
-        <w:spacing w:after="200" w:lineRule="auto"/>
-        <w:rPr>
-          <w:sz w:val="24"/>
-          <w:szCs w:val="24"/>
-        </w:rPr>
-      </w:pPr>
-      <w:r>
-        <w:rPr>
-          <w:sz w:val="24"/>
-          <w:szCs w:val="24"/>
-          <w:rtl w:val="0"/>
-        </w:rPr>
-        <w:t xml:space="preserve">of human civilization never could… </w:t>
-      </w:r>
-    </w:p>
-    <w:p>
-      <w:pPr>
-        <w:spacing w:after="200" w:lineRule="auto"/>
-        <w:rPr>
-          <w:sz w:val="24"/>
-          <w:szCs w:val="24"/>
-        </w:rPr>
-      </w:pPr>
-      <w:r>
-        <w:rPr>
-          <w:sz w:val="24"/>
-          <w:szCs w:val="24"/>
-          <w:rtl w:val="0"/>
-        </w:rPr>
-        <w:t xml:space="preserve">World peace</w:t>
-      </w:r>
-    </w:p>
-    <w:p>
-      <w:pPr>
-        <w:spacing w:after="200" w:lineRule="auto"/>
-        <w:rPr>
-          <w:sz w:val="24"/>
-          <w:szCs w:val="24"/>
-        </w:rPr>
-      </w:pPr>
-      <w:r>
-        <w:rPr>
-          <w:sz w:val="24"/>
-          <w:szCs w:val="24"/>
-          <w:rtl w:val="0"/>
-        </w:rPr>
-        <w:t xml:space="preserve">Ok… so how do we stop it?</w:t>
-      </w:r>
-    </w:p>
-    <w:p>
-      <w:pPr>
-        <w:spacing w:after="200" w:lineRule="auto"/>
-        <w:rPr>
-          <w:sz w:val="24"/>
-          <w:szCs w:val="24"/>
-        </w:rPr>
-      </w:pPr>
-      <w:r>
-        <w:rPr>
-          <w:sz w:val="24"/>
-          <w:szCs w:val="24"/>
-          <w:rtl w:val="0"/>
-        </w:rPr>
-        <w:t xml:space="preserve">Yes, yes. Stop it. Of course…</w:t>
-      </w:r>
-    </w:p>
-    <w:p>
-      <w:pPr>
-        <w:spacing w:after="200" w:lineRule="auto"/>
-        <w:rPr>
-          <w:sz w:val="24"/>
-          <w:szCs w:val="24"/>
-        </w:rPr>
-      </w:pPr>
-      <w:r>
-        <w:rPr>
-          <w:sz w:val="24"/>
-          <w:szCs w:val="24"/>
-          <w:rtl w:val="0"/>
-        </w:rPr>
-        <w:t xml:space="preserve">This all started with the meteor. It’s conducting everything.</w:t>
-      </w:r>
-    </w:p>
-    <w:p>
-      <w:pPr>
-        <w:spacing w:after="200" w:lineRule="auto"/>
-        <w:rPr>
-          <w:sz w:val="24"/>
-          <w:szCs w:val="24"/>
-        </w:rPr>
-      </w:pPr>
-      <w:r>
-        <w:rPr>
-          <w:sz w:val="24"/>
-          <w:szCs w:val="24"/>
-          <w:rtl w:val="0"/>
-        </w:rPr>
-        <w:t xml:space="preserve">If we take it out, will all these things just… die?</w:t>
-      </w:r>
-    </w:p>
-    <w:p>
-      <w:pPr>
-        <w:spacing w:after="200" w:lineRule="auto"/>
-        <w:rPr>
-          <w:sz w:val="24"/>
-          <w:szCs w:val="24"/>
-        </w:rPr>
-      </w:pPr>
-      <w:r>
-        <w:rPr>
-          <w:sz w:val="24"/>
-          <w:szCs w:val="24"/>
-          <w:rtl w:val="0"/>
-        </w:rPr>
-        <w:t xml:space="preserve">That’s a sound theory… Which is why it must never leave this room!</w:t>
-      </w:r>
-    </w:p>
-    <w:p>
-      <w:pPr>
-        <w:spacing w:after="200" w:lineRule="auto"/>
-        <w:rPr>
-          <w:sz w:val="24"/>
-          <w:szCs w:val="24"/>
-        </w:rPr>
-      </w:pPr>
-      <w:r>
-        <w:rPr>
-          <w:sz w:val="24"/>
-          <w:szCs w:val="24"/>
-          <w:rtl w:val="0"/>
-        </w:rPr>
-        <w:t xml:space="preserve">What?</w:t>
-      </w:r>
-    </w:p>
-    <w:p>
-      <w:pPr>
-        <w:spacing w:after="200" w:lineRule="auto"/>
-        <w:rPr>
-          <w:sz w:val="24"/>
-          <w:szCs w:val="24"/>
-        </w:rPr>
-      </w:pPr>
-      <w:r>
-        <w:rPr>
-          <w:sz w:val="24"/>
-          <w:szCs w:val="24"/>
-          <w:rtl w:val="0"/>
-        </w:rPr>
-        <w:t xml:space="preserve">Shshhhhh… Don’t fight it, Emma. Don’t fight it.</w:t>
-      </w:r>
-    </w:p>
-    <w:p>
-      <w:pPr>
-        <w:spacing w:after="200" w:lineRule="auto"/>
-        <w:rPr>
-          <w:sz w:val="24"/>
-          <w:szCs w:val="24"/>
-        </w:rPr>
-      </w:pPr>
-      <w:r>
-        <w:rPr>
-          <w:sz w:val="24"/>
-          <w:szCs w:val="24"/>
-          <w:rtl w:val="0"/>
-        </w:rPr>
-        <w:t xml:space="preserve">—---</w:t>
-      </w:r>
-    </w:p>
-    <w:p>
-      <w:pPr>
-        <w:spacing w:after="200" w:lineRule="auto"/>
-        <w:rPr>
-          <w:sz w:val="24"/>
-          <w:szCs w:val="24"/>
-        </w:rPr>
-      </w:pPr>
-      <w:r>
-        <w:rPr>
-          <w:sz w:val="24"/>
-          <w:szCs w:val="24"/>
-          <w:rtl w:val="0"/>
-        </w:rPr>
-        <w:t xml:space="preserve">Sorry for that bump on the head, son. </w:t>
-      </w:r>
-    </w:p>
-    <w:p>
-      <w:pPr>
-        <w:spacing w:after="200" w:lineRule="auto"/>
-        <w:rPr>
-          <w:sz w:val="24"/>
-          <w:szCs w:val="24"/>
-        </w:rPr>
-      </w:pPr>
-      <w:r>
-        <w:rPr>
-          <w:sz w:val="24"/>
-          <w:szCs w:val="24"/>
-          <w:rtl w:val="0"/>
-        </w:rPr>
-        <w:t xml:space="preserve">You can never be too </w:t>
-      </w:r>
-      <w:commentRangeStart w:id="18"/>
-      <w:r>
-        <w:rPr>
-          <w:sz w:val="24"/>
-          <w:szCs w:val="24"/>
-          <w:rtl w:val="0"/>
-        </w:rPr>
-        <w:t xml:space="preserve">careful</w:t>
-      </w:r>
-      <w:commentRangeEnd w:id="18"/>
-      <w:r>
-        <w:commentReference w:id="18"/>
-      </w:r>
-      <w:r>
-        <w:rPr>
-          <w:sz w:val="24"/>
-          <w:szCs w:val="24"/>
-          <w:rtl w:val="0"/>
-        </w:rPr>
         <w:t xml:space="preserve">. What’s your name?</w:t>
       </w:r>
     </w:p>
@@ -22699,7 +22824,7 @@
           <w:szCs w:val="24"/>
           <w:rtl w:val="0"/>
         </w:rPr>
-        <w:t xml:space="preserve">------</w:t>
+        <w:t xml:space="preserve">[blank]</w:t>
       </w:r>
     </w:p>
     <w:p>
@@ -24179,7 +24304,7 @@
           <w:szCs w:val="24"/>
           <w:rtl w:val="0"/>
         </w:rPr>
-        <w:t xml:space="preserve">Stocks, bonds, other.. business lingo...</w:t>
+        <w:t xml:space="preserve">Stocks, bonds, other business lingo…</w:t>
       </w:r>
     </w:p>
     <w:p>
@@ -24906,7 +25031,7 @@
           <w:szCs w:val="24"/>
           <w:rtl w:val="0"/>
         </w:rPr>
-        <w:t xml:space="preserve">-----</w:t>
+        <w:t xml:space="preserve">[blank]</w:t>
       </w:r>
     </w:p>
     <w:p>
@@ -25925,7 +26050,7 @@
           <w:szCs w:val="24"/>
           <w:rtl w:val="0"/>
         </w:rPr>
-        <w:t xml:space="preserve">—-</w:t>
+        <w:t xml:space="preserve">[blank]</w:t>
       </w:r>
     </w:p>
     <w:p>
@@ -26921,7 +27046,7 @@
           <w:szCs w:val="24"/>
           <w:rtl w:val="0"/>
         </w:rPr>
-        <w:t xml:space="preserve">-</w:t>
+        <w:t xml:space="preserve">[blank]</w:t>
       </w:r>
     </w:p>
     <w:p>
@@ -27584,7 +27709,7 @@
           <w:szCs w:val="24"/>
           <w:rtl w:val="0"/>
         </w:rPr>
-        <w:t xml:space="preserve">—--</w:t>
+        <w:t xml:space="preserve">[blank]</w:t>
       </w:r>
     </w:p>
     <w:p>
@@ -28213,6 +28338,91 @@
           <w:szCs w:val="24"/>
           <w:rtl w:val="0"/>
         </w:rPr>
+        <w:t xml:space="preserve">It’s your proximity to the meteor, Paul. </w:t>
+      </w:r>
+    </w:p>
+    <w:p>
+      <w:pPr>
+        <w:spacing w:after="200" w:lineRule="auto"/>
+        <w:rPr>
+          <w:sz w:val="24"/>
+          <w:szCs w:val="24"/>
+        </w:rPr>
+      </w:pPr>
+      <w:r>
+        <w:rPr>
+          <w:sz w:val="24"/>
+          <w:szCs w:val="24"/>
+          <w:rtl w:val="0"/>
+        </w:rPr>
+        <w:t xml:space="preserve">The air here is thick with its spores! </w:t>
+      </w:r>
+    </w:p>
+    <w:p>
+      <w:pPr>
+        <w:spacing w:after="200" w:lineRule="auto"/>
+        <w:rPr>
+          <w:sz w:val="24"/>
+          <w:szCs w:val="24"/>
+        </w:rPr>
+      </w:pPr>
+      <w:r>
+        <w:rPr>
+          <w:sz w:val="24"/>
+          <w:szCs w:val="24"/>
+          <w:rtl w:val="0"/>
+        </w:rPr>
+        <w:t xml:space="preserve">Feel your apotheosis begin as they take root in your mind! </w:t>
+      </w:r>
+    </w:p>
+    <w:p>
+      <w:pPr>
+        <w:spacing w:after="200" w:lineRule="auto"/>
+        <w:rPr>
+          <w:sz w:val="24"/>
+          <w:szCs w:val="24"/>
+        </w:rPr>
+      </w:pPr>
+      <w:r>
+        <w:rPr>
+          <w:sz w:val="24"/>
+          <w:szCs w:val="24"/>
+          <w:rtl w:val="0"/>
+        </w:rPr>
+        <w:t xml:space="preserve">Do you really think we’d let you kill us? </w:t>
+      </w:r>
+    </w:p>
+    <w:p>
+      <w:pPr>
+        <w:spacing w:after="200" w:lineRule="auto"/>
+        <w:rPr>
+          <w:sz w:val="24"/>
+          <w:szCs w:val="24"/>
+        </w:rPr>
+      </w:pPr>
+      <w:r>
+        <w:rPr>
+          <w:sz w:val="24"/>
+          <w:szCs w:val="24"/>
+          <w:rtl w:val="0"/>
+        </w:rPr>
+        <w:t xml:space="preserve">You’ll be one of us before you can pull that pin!</w:t>
+      </w:r>
+    </w:p>
+    <w:p>
+      <w:pPr>
+        <w:spacing w:after="200" w:lineRule="auto"/>
+        <w:rPr>
+          <w:sz w:val="24"/>
+          <w:szCs w:val="24"/>
+        </w:rPr>
+      </w:pPr>
+      <w:r>
+        <w:rPr>
+          <w:sz w:val="24"/>
+          <w:szCs w:val="24"/>
+          <w:rtl w:val="0"/>
+        </w:rPr>
         <w:t xml:space="preserve">What was that?!?</w:t>
       </w:r>
     </w:p>
@@ -28247,92 +28457,24 @@
           <w:szCs w:val="24"/>
           <w:rtl w:val="0"/>
         </w:rPr>
-        <w:t xml:space="preserve">It’s your proximity to the meteor, Paul. </w:t>
-      </w:r>
-    </w:p>
-    <w:p>
-      <w:pPr>
-        <w:spacing w:after="200" w:lineRule="auto"/>
-        <w:rPr>
-          <w:sz w:val="24"/>
-          <w:szCs w:val="24"/>
-        </w:rPr>
-      </w:pPr>
-      <w:r>
-        <w:rPr>
-          <w:sz w:val="24"/>
-          <w:szCs w:val="24"/>
-          <w:rtl w:val="0"/>
-        </w:rPr>
-        <w:t xml:space="preserve">The air here is thick with its spores! </w:t>
-      </w:r>
-    </w:p>
-    <w:p>
-      <w:pPr>
-        <w:spacing w:after="200" w:lineRule="auto"/>
-        <w:rPr>
-          <w:sz w:val="24"/>
-          <w:szCs w:val="24"/>
-        </w:rPr>
-      </w:pPr>
-      <w:r>
-        <w:rPr>
-          <w:sz w:val="24"/>
-          <w:szCs w:val="24"/>
-          <w:rtl w:val="0"/>
-        </w:rPr>
-        <w:t xml:space="preserve">Feel your apotheosis begin as they take root in your mind! </w:t>
-      </w:r>
-    </w:p>
-    <w:p>
-      <w:pPr>
-        <w:spacing w:after="200" w:lineRule="auto"/>
-        <w:rPr>
-          <w:sz w:val="24"/>
-          <w:szCs w:val="24"/>
-        </w:rPr>
-      </w:pPr>
-      <w:r>
-        <w:rPr>
-          <w:sz w:val="24"/>
-          <w:szCs w:val="24"/>
-          <w:rtl w:val="0"/>
-        </w:rPr>
-        <w:t xml:space="preserve">Do you really think we’d let you kill us? </w:t>
-      </w:r>
-    </w:p>
-    <w:p>
-      <w:pPr>
-        <w:spacing w:after="200" w:lineRule="auto"/>
-        <w:rPr>
-          <w:sz w:val="24"/>
-          <w:szCs w:val="24"/>
-        </w:rPr>
-      </w:pPr>
-      <w:r>
-        <w:rPr>
-          <w:sz w:val="24"/>
-          <w:szCs w:val="24"/>
-          <w:rtl w:val="0"/>
-        </w:rPr>
-        <w:t xml:space="preserve">You’ll be one of us before you can pull that pin!</w:t>
-      </w:r>
-    </w:p>
-    <w:p>
-      <w:pPr>
-        <w:spacing w:after="200" w:lineRule="auto"/>
-        <w:rPr>
-          <w:sz w:val="24"/>
-          <w:szCs w:val="24"/>
-        </w:rPr>
-      </w:pPr>
-      <w:r>
-        <w:rPr>
-          <w:sz w:val="24"/>
-          <w:szCs w:val="24"/>
-          <w:rtl w:val="0"/>
-        </w:rPr>
-        <w:t xml:space="preserve">Was that a note Or just a sound?</w:t>
+        <w:t xml:space="preserve">Was that a note </w:t>
+      </w:r>
+    </w:p>
+    <w:p>
+      <w:pPr>
+        <w:spacing w:after="200" w:lineRule="auto"/>
+        <w:rPr>
+          <w:sz w:val="24"/>
+          <w:szCs w:val="24"/>
+        </w:rPr>
+      </w:pPr>
+      <w:r>
+        <w:rPr>
+          <w:sz w:val="24"/>
+          <w:szCs w:val="24"/>
+          <w:rtl w:val="0"/>
+        </w:rPr>
+        <w:t xml:space="preserve">Or just a sound?</w:t>
       </w:r>
     </w:p>
     <w:p>
@@ -28366,6 +28508,23 @@
           <w:szCs w:val="24"/>
           <w:rtl w:val="0"/>
         </w:rPr>
+        <w:t xml:space="preserve">Oh god, just…</w:t>
+      </w:r>
+    </w:p>
+    <w:p>
+      <w:pPr>
+        <w:spacing w:after="200" w:lineRule="auto"/>
+        <w:rPr>
+          <w:sz w:val="24"/>
+          <w:szCs w:val="24"/>
+        </w:rPr>
+      </w:pPr>
+      <w:r>
+        <w:rPr>
+          <w:sz w:val="24"/>
+          <w:szCs w:val="24"/>
+          <w:rtl w:val="0"/>
+        </w:rPr>
         <w:t xml:space="preserve">STOP IT!</w:t>
       </w:r>
     </w:p>
@@ -28400,24 +28559,58 @@
           <w:szCs w:val="24"/>
           <w:rtl w:val="0"/>
         </w:rPr>
-        <w:t xml:space="preserve">Is this me or IS THIS YOU?!? AM I DEAD?</w:t>
-      </w:r>
-    </w:p>
-    <w:p>
-      <w:pPr>
-        <w:spacing w:after="200" w:lineRule="auto"/>
-        <w:rPr>
-          <w:sz w:val="24"/>
-          <w:szCs w:val="24"/>
-        </w:rPr>
-      </w:pPr>
-      <w:r>
-        <w:rPr>
-          <w:sz w:val="24"/>
-          <w:szCs w:val="24"/>
-          <w:rtl w:val="0"/>
-        </w:rPr>
-        <w:t xml:space="preserve">I’m coming apart AT THE SEAMS!</w:t>
+        <w:t xml:space="preserve">Is this me or </w:t>
+      </w:r>
+    </w:p>
+    <w:p>
+      <w:pPr>
+        <w:spacing w:after="200" w:lineRule="auto"/>
+        <w:rPr>
+          <w:sz w:val="24"/>
+          <w:szCs w:val="24"/>
+        </w:rPr>
+      </w:pPr>
+      <w:r>
+        <w:rPr>
+          <w:sz w:val="24"/>
+          <w:szCs w:val="24"/>
+          <w:rtl w:val="0"/>
+        </w:rPr>
+        <w:t xml:space="preserve">IS THIS YOU?!? AM I DEAD?</w:t>
+      </w:r>
+    </w:p>
+    <w:p>
+      <w:pPr>
+        <w:spacing w:after="200" w:lineRule="auto"/>
+        <w:rPr>
+          <w:sz w:val="24"/>
+          <w:szCs w:val="24"/>
+        </w:rPr>
+      </w:pPr>
+      <w:r>
+        <w:rPr>
+          <w:sz w:val="24"/>
+          <w:szCs w:val="24"/>
+          <w:rtl w:val="0"/>
+        </w:rPr>
+        <w:t xml:space="preserve">I’m coming apart </w:t>
+      </w:r>
+    </w:p>
+    <w:p>
+      <w:pPr>
+        <w:spacing w:after="200" w:lineRule="auto"/>
+        <w:rPr>
+          <w:sz w:val="24"/>
+          <w:szCs w:val="24"/>
+        </w:rPr>
+      </w:pPr>
+      <w:r>
+        <w:rPr>
+          <w:sz w:val="24"/>
+          <w:szCs w:val="24"/>
+          <w:rtl w:val="0"/>
+        </w:rPr>
+        <w:t xml:space="preserve">AT THE SEAMS!</w:t>
       </w:r>
     </w:p>
     <w:p>
@@ -28519,7 +28712,24 @@
           <w:szCs w:val="24"/>
           <w:rtl w:val="0"/>
         </w:rPr>
-        <w:t xml:space="preserve">I’ve never been happy. Wouldn’t that be nice?</w:t>
+        <w:t xml:space="preserve">I’ve never been happy. </w:t>
+      </w:r>
+    </w:p>
+    <w:p>
+      <w:pPr>
+        <w:spacing w:after="200" w:lineRule="auto"/>
+        <w:rPr>
+          <w:sz w:val="24"/>
+          <w:szCs w:val="24"/>
+        </w:rPr>
+      </w:pPr>
+      <w:r>
+        <w:rPr>
+          <w:sz w:val="24"/>
+          <w:szCs w:val="24"/>
+          <w:rtl w:val="0"/>
+        </w:rPr>
+        <w:t xml:space="preserve">Wouldn’t that be nice?</w:t>
       </w:r>
     </w:p>
     <w:p>
@@ -28604,24 +28814,58 @@
           <w:szCs w:val="24"/>
           <w:rtl w:val="0"/>
         </w:rPr>
-        <w:t xml:space="preserve">Am I crazy?! Maybe I’ve always been…</w:t>
-      </w:r>
-    </w:p>
-    <w:p>
-      <w:pPr>
-        <w:spacing w:after="200" w:lineRule="auto"/>
-        <w:rPr>
-          <w:sz w:val="24"/>
-          <w:szCs w:val="24"/>
-        </w:rPr>
-      </w:pPr>
-      <w:r>
-        <w:rPr>
-          <w:sz w:val="24"/>
-          <w:szCs w:val="24"/>
-          <w:rtl w:val="0"/>
-        </w:rPr>
-        <w:t xml:space="preserve">I’ve become what I’ve hated. Or maybe I never did.</w:t>
+        <w:t xml:space="preserve">Am I crazy?! </w:t>
+      </w:r>
+    </w:p>
+    <w:p>
+      <w:pPr>
+        <w:spacing w:after="200" w:lineRule="auto"/>
+        <w:rPr>
+          <w:sz w:val="24"/>
+          <w:szCs w:val="24"/>
+        </w:rPr>
+      </w:pPr>
+      <w:r>
+        <w:rPr>
+          <w:sz w:val="24"/>
+          <w:szCs w:val="24"/>
+          <w:rtl w:val="0"/>
+        </w:rPr>
+        <w:t xml:space="preserve">Maybe I’ve always been…</w:t>
+      </w:r>
+    </w:p>
+    <w:p>
+      <w:pPr>
+        <w:spacing w:after="200" w:lineRule="auto"/>
+        <w:rPr>
+          <w:sz w:val="24"/>
+          <w:szCs w:val="24"/>
+        </w:rPr>
+      </w:pPr>
+      <w:r>
+        <w:rPr>
+          <w:sz w:val="24"/>
+          <w:szCs w:val="24"/>
+          <w:rtl w:val="0"/>
+        </w:rPr>
+        <w:t xml:space="preserve">I’ve become what I’ve hated. </w:t>
+      </w:r>
+    </w:p>
+    <w:p>
+      <w:pPr>
+        <w:spacing w:after="200" w:lineRule="auto"/>
+        <w:rPr>
+          <w:sz w:val="24"/>
+          <w:szCs w:val="24"/>
+        </w:rPr>
+      </w:pPr>
+      <w:r>
+        <w:rPr>
+          <w:sz w:val="24"/>
+          <w:szCs w:val="24"/>
+          <w:rtl w:val="0"/>
+        </w:rPr>
+        <w:t xml:space="preserve">Or maybe I never did.</w:t>
       </w:r>
     </w:p>
     <w:p>
@@ -28774,24 +29018,41 @@
           <w:szCs w:val="24"/>
           <w:rtl w:val="0"/>
         </w:rPr>
-        <w:t xml:space="preserve">God help me out, if I let it….</w:t>
-      </w:r>
-    </w:p>
-    <w:p>
-      <w:pPr>
-        <w:spacing w:after="200" w:lineRule="auto"/>
-        <w:rPr>
-          <w:sz w:val="24"/>
-          <w:szCs w:val="24"/>
-        </w:rPr>
-      </w:pPr>
-      <w:r>
-        <w:rPr>
-          <w:sz w:val="24"/>
-          <w:szCs w:val="24"/>
-          <w:rtl w:val="0"/>
-        </w:rPr>
-        <w:t xml:space="preserve">OOOOOOUUUUUUTTTT!!!!!!!</w:t>
+        <w:t xml:space="preserve">God help me out, </w:t>
+      </w:r>
+    </w:p>
+    <w:p>
+      <w:pPr>
+        <w:spacing w:after="200" w:lineRule="auto"/>
+        <w:rPr>
+          <w:sz w:val="24"/>
+          <w:szCs w:val="24"/>
+        </w:rPr>
+      </w:pPr>
+      <w:r>
+        <w:rPr>
+          <w:sz w:val="24"/>
+          <w:szCs w:val="24"/>
+          <w:rtl w:val="0"/>
+        </w:rPr>
+        <w:t xml:space="preserve">if I let it…</w:t>
+      </w:r>
+    </w:p>
+    <w:p>
+      <w:pPr>
+        <w:spacing w:after="200" w:lineRule="auto"/>
+        <w:rPr>
+          <w:sz w:val="24"/>
+          <w:szCs w:val="24"/>
+        </w:rPr>
+      </w:pPr>
+      <w:r>
+        <w:rPr>
+          <w:sz w:val="24"/>
+          <w:szCs w:val="24"/>
+          <w:rtl w:val="0"/>
+        </w:rPr>
+        <w:t xml:space="preserve">OOOOUUUUTTTT!!!</w:t>
       </w:r>
     </w:p>
     <w:p>
@@ -28859,7 +29120,7 @@
           <w:szCs w:val="24"/>
           <w:rtl w:val="0"/>
         </w:rPr>
-        <w:t xml:space="preserve">—---</w:t>
+        <w:t xml:space="preserve">[blank]</w:t>
       </w:r>
     </w:p>
     <w:p>
@@ -29473,6 +29734,23 @@
           <w:szCs w:val="24"/>
           <w:rtl w:val="0"/>
         </w:rPr>
+        <w:t xml:space="preserve">[blank]</w:t>
+      </w:r>
+    </w:p>
+    <w:p>
+      <w:pPr>
+        <w:spacing w:after="200" w:lineRule="auto"/>
+        <w:rPr>
+          <w:sz w:val="24"/>
+          <w:szCs w:val="24"/>
+        </w:rPr>
+      </w:pPr>
+      <w:r>
+        <w:rPr>
+          <w:sz w:val="24"/>
+          <w:szCs w:val="24"/>
+          <w:rtl w:val="0"/>
+        </w:rPr>
         <w:t xml:space="preserve">Paul?</w:t>
       </w:r>
     </w:p>
@@ -29490,24 +29768,24 @@
           <w:szCs w:val="24"/>
           <w:rtl w:val="0"/>
         </w:rPr>
-        <w:t xml:space="preserve">Hi</w:t>
-      </w:r>
-    </w:p>
-    <w:p>
-      <w:pPr>
-        <w:spacing w:after="200" w:lineRule="auto"/>
-        <w:rPr>
-          <w:sz w:val="24"/>
-          <w:szCs w:val="24"/>
-        </w:rPr>
-      </w:pPr>
-      <w:r>
-        <w:rPr>
-          <w:sz w:val="24"/>
-          <w:szCs w:val="24"/>
-          <w:rtl w:val="0"/>
-        </w:rPr>
-        <w:t xml:space="preserve">Holy shit, Paul!!! Oh, thank god. You made it. Paul. We made it.</w:t>
+        <w:t xml:space="preserve">Holy shit, Paul!!! Oh, thank god. </w:t>
+      </w:r>
+    </w:p>
+    <w:p>
+      <w:pPr>
+        <w:spacing w:after="200" w:lineRule="auto"/>
+        <w:rPr>
+          <w:sz w:val="24"/>
+          <w:szCs w:val="24"/>
+        </w:rPr>
+      </w:pPr>
+      <w:r>
+        <w:rPr>
+          <w:sz w:val="24"/>
+          <w:szCs w:val="24"/>
+          <w:rtl w:val="0"/>
+        </w:rPr>
+        <w:t xml:space="preserve">You made it. Paul. We made it.</w:t>
       </w:r>
     </w:p>
     <w:p>
@@ -30271,6 +30549,23 @@
           <w:rtl w:val="0"/>
         </w:rPr>
         <w:t xml:space="preserve">Inevitable!</w:t>
+      </w:r>
+    </w:p>
+    <w:p>
+      <w:pPr>
+        <w:spacing w:after="200" w:lineRule="auto"/>
+        <w:rPr>
+          <w:sz w:val="24"/>
+          <w:szCs w:val="24"/>
+        </w:rPr>
+      </w:pPr>
+      <w:r>
+        <w:rPr>
+          <w:sz w:val="24"/>
+          <w:szCs w:val="24"/>
+          <w:rtl w:val="0"/>
+        </w:rPr>
+        <w:t xml:space="preserve">[blank]</w:t>
       </w:r>
     </w:p>
     <w:p>
@@ -30664,7 +30959,7 @@
       </w:r>
     </w:p>
   </w:comment>
-  <w:comment w:author="Like That" w:id="9" w:date="2026-06-30T17:52:26Z">
+  <w:comment w:author="Like That" w:id="8" w:date="2026-06-30T17:52:26Z">
     <w:p>
       <w:pPr>
         <w:keepNext w:val="0"/>
@@ -30833,7 +31128,7 @@
       </w:r>
     </w:p>
   </w:comment>
-  <w:comment w:author="Like That" w:id="10" w:date="2026-07-04T21:59:02Z">
+  <w:comment w:author="Like That" w:id="9" w:date="2026-07-04T21:59:02Z">
     <w:p>
       <w:pPr>
         <w:keepNext w:val="0"/>
@@ -31078,7 +31373,7 @@
       </w:r>
     </w:p>
   </w:comment>
-  <w:comment w:author="Like That" w:id="11" w:date="2026-06-30T17:52:46Z">
+  <w:comment w:author="Like That" w:id="10" w:date="2026-06-30T17:52:46Z">
     <w:p>
       <w:pPr>
         <w:keepNext w:val="0"/>
@@ -31171,7 +31466,7 @@
       </w:r>
     </w:p>
   </w:comment>
-  <w:comment w:author="Like That" w:id="13" w:date="2026-06-30T17:58:47Z">
+  <w:comment w:author="Like That" w:id="12" w:date="2026-06-30T17:58:47Z">
     <w:p>
       <w:pPr>
         <w:keepNext w:val="0"/>
@@ -31226,7 +31521,7 @@
       </w:r>
     </w:p>
   </w:comment>
-  <w:comment w:author="Like That" w:id="14" w:date="2026-06-30T17:59:04Z">
+  <w:comment w:author="Like That" w:id="13" w:date="2026-06-30T17:59:04Z">
     <w:p>
       <w:pPr>
         <w:keepNext w:val="0"/>
@@ -31281,7 +31576,7 @@
       </w:r>
     </w:p>
   </w:comment>
-  <w:comment w:author="Like That" w:id="12" w:date="2026-06-30T17:54:19Z">
+  <w:comment w:author="Like That" w:id="11" w:date="2026-06-30T17:54:19Z">
     <w:p>
       <w:pPr>
         <w:keepNext w:val="0"/>
@@ -31336,7 +31631,7 @@
       </w:r>
     </w:p>
   </w:comment>
-  <w:comment w:author="Like That" w:id="16" w:date="2026-06-30T18:05:50Z">
+  <w:comment w:author="Like That" w:id="15" w:date="2026-06-30T18:05:50Z">
     <w:p>
       <w:pPr>
         <w:keepNext w:val="0"/>
@@ -31391,7 +31686,7 @@
       </w:r>
     </w:p>
   </w:comment>
-  <w:comment w:author="Like That" w:id="17" w:date="2026-06-30T18:06:19Z">
+  <w:comment w:author="Like That" w:id="16" w:date="2026-06-30T18:06:19Z">
     <w:p>
       <w:pPr>
         <w:keepNext w:val="0"/>
@@ -31446,7 +31741,7 @@
       </w:r>
     </w:p>
   </w:comment>
-  <w:comment w:author="Like That" w:id="18" w:date="2026-06-30T18:07:27Z">
+  <w:comment w:author="Like That" w:id="17" w:date="2026-06-30T18:07:27Z">
     <w:p>
       <w:pPr>
         <w:keepNext w:val="0"/>
@@ -31596,7 +31891,7 @@
       </w:r>
     </w:p>
   </w:comment>
-  <w:comment w:author="Like That" w:id="5" w:date="2026-06-30T17:24:04Z">
+  <w:comment w:author="Like That" w:id="4" w:date="2026-06-30T17:24:04Z">
     <w:p>
       <w:pPr>
         <w:keepNext w:val="0"/>
@@ -31765,7 +32060,7 @@
       </w:r>
     </w:p>
   </w:comment>
-  <w:comment w:author="יותם סבירסקי" w:id="6" w:date="2026-06-30T20:40:02Z">
+  <w:comment w:author="יותם סבירסקי" w:id="5" w:date="2026-06-30T20:40:02Z">
     <w:p>
       <w:pPr>
         <w:keepNext w:val="0"/>
@@ -31901,7 +32196,7 @@
       </w:r>
     </w:p>
   </w:comment>
-  <w:comment w:author="יותם סבירסקי" w:id="7" w:date="2026-06-30T20:40:06Z">
+  <w:comment w:author="יותם סבירסקי" w:id="6" w:date="2026-06-30T20:40:06Z">
     <w:p>
       <w:pPr>
         <w:keepNext w:val="0"/>
@@ -32037,7 +32332,7 @@
       </w:r>
     </w:p>
   </w:comment>
-  <w:comment w:author="Like That" w:id="8" w:date="2026-06-30T17:45:47Z">
+  <w:comment w:author="Like That" w:id="7" w:date="2026-06-30T17:45:47Z">
     <w:p>
       <w:pPr>
         <w:keepNext w:val="0"/>
@@ -32223,7 +32518,7 @@
       </w:r>
     </w:p>
   </w:comment>
-  <w:comment w:author="Like That" w:id="15" w:date="2026-07-04T22:02:20Z">
+  <w:comment w:author="Like That" w:id="14" w:date="2026-07-04T22:02:20Z">
     <w:p>
       <w:pPr>
         <w:keepNext w:val="0"/>
@@ -32354,81 +32649,7 @@
       </w:r>
     </w:p>
   </w:comment>
-  <w:comment w:author="Like That" w:id="3" w:date="2026-06-30T17:23:11Z">
-    <w:p>
-      <w:pPr>
-        <w:keepNext w:val="0"/>
-        <w:keepLines w:val="0"/>
-        <w:pageBreakBefore w:val="0"/>
-        <w:widowControl w:val="0"/>
-        <w:pBdr>
-          <w:top w:space="0" w:sz="0" w:val="nil"/>
-          <w:left w:space="0" w:sz="0" w:val="nil"/>
-          <w:bottom w:space="0" w:sz="0" w:val="nil"/>
-          <w:right w:space="0" w:sz="0" w:val="nil"/>
-          <w:between w:space="0" w:sz="0" w:val="nil"/>
-        </w:pBdr>
-        <w:shd w:fill="auto" w:val="clear"/>
-        <w:spacing w:after="0" w:before="0" w:line="240" w:lineRule="auto"/>
-        <w:ind w:left="0" w:right="0" w:firstLine="0"/>
-        <w:jc w:val="left"/>
-        <w:rPr>
-          <w:rFonts w:ascii="Arial" w:cs="Arial" w:eastAsia="Arial" w:hAnsi="Arial"/>
-          <w:b w:val="0"/>
-          <w:bCs w:val="0"/>
-          <w:i w:val="0"/>
-          <w:iCs w:val="0"/>
-          <w:smallCaps w:val="0"/>
-          <w:strike w:val="0"/>
-          <w:color w:val="000000"/>
-          <w:sz w:val="22"/>
-          <w:szCs w:val="22"/>
-          <w:u w:val="none"/>
-          <w:shd w:fill="auto" w:val="clear"/>
-          <w:vertAlign w:val="baseline"/>
-        </w:rPr>
-      </w:pPr>
-      <w:r>
-        <w:rPr>
-          <w:rFonts w:ascii="Arial" w:cs="Arial" w:eastAsia="Arial" w:hAnsi="Arial"/>
-          <w:b w:val="0"/>
-          <w:bCs w:val="0"/>
-          <w:i w:val="0"/>
-          <w:iCs w:val="0"/>
-          <w:smallCaps w:val="0"/>
-          <w:strike w:val="0"/>
-          <w:color w:val="000000"/>
-          <w:sz w:val="22"/>
-          <w:szCs w:val="22"/>
-          <w:u w:val="none"/>
-          <w:shd w:fill="auto" w:val="clear"/>
-          <w:vertAlign w:val="baseline"/>
-          <w:rtl w:val="1"/>
-        </w:rPr>
-        <w:t xml:space="preserve">אלתרה</w:t>
-      </w:r>
-      <w:r>
-        <w:rPr>
-          <w:rFonts w:ascii="Arial" w:cs="Arial" w:eastAsia="Arial" w:hAnsi="Arial"/>
-          <w:b w:val="0"/>
-          <w:bCs w:val="0"/>
-          <w:i w:val="0"/>
-          <w:iCs w:val="0"/>
-          <w:smallCaps w:val="0"/>
-          <w:strike w:val="0"/>
-          <w:color w:val="000000"/>
-          <w:sz w:val="22"/>
-          <w:szCs w:val="22"/>
-          <w:u w:val="none"/>
-          <w:shd w:fill="auto" w:val="clear"/>
-          <w:vertAlign w:val="baseline"/>
-          <w:rtl w:val="0"/>
-        </w:rPr>
-        <w:t xml:space="preserve">?</w:t>
-      </w:r>
-    </w:p>
-  </w:comment>
-  <w:comment w:author="Like That" w:id="4" w:date="2026-06-30T17:23:36Z">
+  <w:comment w:author="Like That" w:id="3" w:date="2026-06-30T17:23:36Z">
     <w:p>
       <w:pPr>
         <w:keepNext w:val="0"/>

</xml_diff>

<commit_message>
update script and tie cues
</commit_message>
<xml_diff>
--- a/dialogue_only_script.docx
+++ b/dialogue_only_script.docx
@@ -1197,6 +1197,22 @@
     </w:p>
     <w:p>
       <w:pPr>
+        <w:widowControl w:val="0"/>
+        <w:spacing w:before="4" w:lineRule="auto"/>
+        <w:ind w:right="177"/>
+        <w:rPr>
+          <w:sz w:val="24"/>
+          <w:szCs w:val="24"/>
+        </w:rPr>
+      </w:pPr>
+      <w:r>
+        <w:rPr>
+          <w:rtl w:val="0"/>
+        </w:rPr>
+      </w:r>
+    </w:p>
+    <w:p>
+      <w:pPr>
         <w:spacing w:after="200" w:lineRule="auto"/>
         <w:rPr>
           <w:sz w:val="24"/>
@@ -1214,6 +1230,24 @@
     </w:p>
     <w:p>
       <w:pPr>
+        <w:widowControl w:val="0"/>
+        <w:spacing w:before="2" w:lineRule="auto"/>
+        <w:rPr>
+          <w:sz w:val="24"/>
+          <w:szCs w:val="24"/>
+        </w:rPr>
+      </w:pPr>
+      <w:r>
+        <w:rPr>
+          <w:sz w:val="24"/>
+          <w:szCs w:val="24"/>
+          <w:rtl w:val="0"/>
+        </w:rPr>
+        <w:t xml:space="preserve">He’s the guy who didn’t like musicals!</w:t>
+      </w:r>
+    </w:p>
+    <w:p>
+      <w:pPr>
         <w:spacing w:after="200" w:lineRule="auto"/>
         <w:rPr>
           <w:sz w:val="24"/>
@@ -1243,6 +1277,23 @@
           <w:szCs w:val="24"/>
           <w:rtl w:val="0"/>
         </w:rPr>
+        <w:t xml:space="preserve">Nah nah nah nah nah nah</w:t>
+      </w:r>
+    </w:p>
+    <w:p>
+      <w:pPr>
+        <w:spacing w:after="200" w:lineRule="auto"/>
+        <w:rPr>
+          <w:sz w:val="24"/>
+          <w:szCs w:val="24"/>
+        </w:rPr>
+      </w:pPr>
+      <w:r>
+        <w:rPr>
+          <w:sz w:val="24"/>
+          <w:szCs w:val="24"/>
+          <w:rtl w:val="0"/>
+        </w:rPr>
         <w:t xml:space="preserve">Didn’t like, didn’t like, didn’t like-a-like-‘em …</w:t>
       </w:r>
     </w:p>
@@ -1252,6 +1303,23 @@
         <w:rPr>
           <w:sz w:val="24"/>
           <w:szCs w:val="24"/>
+        </w:rPr>
+      </w:pPr>
+      <w:r>
+        <w:rPr>
+          <w:sz w:val="24"/>
+          <w:szCs w:val="24"/>
+          <w:rtl w:val="0"/>
+        </w:rPr>
+        <w:t xml:space="preserve">Nah nah nah nah nah nah nah!</w:t>
+      </w:r>
+    </w:p>
+    <w:p>
+      <w:pPr>
+        <w:spacing w:after="200" w:lineRule="auto"/>
+        <w:rPr>
+          <w:sz w:val="24"/>
+          <w:szCs w:val="24"/>
           <w:u w:val="single"/>
         </w:rPr>
       </w:pPr>
@@ -1267,19 +1335,43 @@
     </w:p>
     <w:p>
       <w:pPr>
-        <w:spacing w:after="200" w:lineRule="auto"/>
-        <w:rPr>
-          <w:sz w:val="24"/>
-          <w:szCs w:val="24"/>
-        </w:rPr>
-      </w:pPr>
-      <w:r>
-        <w:rPr>
-          <w:sz w:val="24"/>
-          <w:szCs w:val="24"/>
-          <w:rtl w:val="0"/>
-        </w:rPr>
-        <w:t xml:space="preserve">Didn’t like, didn’t like, didn’t like-a-like-‘em</w:t>
+        <w:widowControl w:val="0"/>
+        <w:spacing w:before="3" w:lineRule="auto"/>
+        <w:rPr>
+          <w:sz w:val="24"/>
+          <w:szCs w:val="24"/>
+          <w:u w:val="single"/>
+        </w:rPr>
+      </w:pPr>
+      <w:r>
+        <w:rPr>
+          <w:sz w:val="24"/>
+          <w:szCs w:val="24"/>
+          <w:rtl w:val="0"/>
+        </w:rPr>
+        <w:t xml:space="preserve">He definitely won’t like this!</w:t>
+      </w:r>
+      <w:r>
+        <w:rPr>
+          <w:rtl w:val="0"/>
+        </w:rPr>
+      </w:r>
+    </w:p>
+    <w:p>
+      <w:pPr>
+        <w:spacing w:after="200" w:lineRule="auto"/>
+        <w:rPr>
+          <w:sz w:val="24"/>
+          <w:szCs w:val="24"/>
+        </w:rPr>
+      </w:pPr>
+      <w:r>
+        <w:rPr>
+          <w:sz w:val="24"/>
+          <w:szCs w:val="24"/>
+          <w:rtl w:val="0"/>
+        </w:rPr>
+        <w:t xml:space="preserve">Didn’t like, didn’t like, didn’t like-a-like-‘ems</w:t>
       </w:r>
     </w:p>
     <w:p>
@@ -3206,7 +3298,7 @@
         <w:t xml:space="preserve">. That’s a new thing. The owner just came back from Japan, </w:t>
         <w:br w:type="textWrapping"/>
         <w:br w:type="textWrapping"/>
-        <w:t xml:space="preserve">saw the whole Singing Café thing, and decided to bring it over. </w:t>
+        <w:t xml:space="preserve">saw the whole Singing Cafe thing, and decided to bring it over. </w:t>
         <w:br w:type="textWrapping"/>
         <w:br w:type="textWrapping"/>
         <w:t xml:space="preserve">But, you know… there’s a line, and people come here to work. </w:t>
@@ -3507,7 +3599,7 @@
           <w:szCs w:val="24"/>
           <w:rtl w:val="0"/>
         </w:rPr>
-        <w:t xml:space="preserve">I think it’s really a fun idea, Nora.</w:t>
+        <w:t xml:space="preserve">I think it’s really a nice idea, Nora.</w:t>
       </w:r>
     </w:p>
     <w:p>
@@ -4702,7 +4794,7 @@
           <w:szCs w:val="24"/>
           <w:rtl w:val="0"/>
         </w:rPr>
-        <w:t xml:space="preserve">Oh yeah? About the campaign that doesn’t exist? </w:t>
+        <w:t xml:space="preserve">Oh yeah? About the fake campaign? </w:t>
       </w:r>
     </w:p>
     <w:p>
@@ -9098,6 +9190,8 @@
         <w:widowControl w:val="0"/>
         <w:spacing w:before="1" w:lineRule="auto"/>
         <w:rPr>
+          <w:i w:val="1"/>
+          <w:iCs w:val="1"/>
           <w:sz w:val="24"/>
           <w:szCs w:val="24"/>
         </w:rPr>
@@ -9118,30 +9212,25 @@
       </w:r>
       <w:r>
         <w:rPr>
+          <w:rtl w:val="0"/>
+        </w:rPr>
+      </w:r>
+    </w:p>
+    <w:p>
+      <w:pPr>
+        <w:widowControl w:val="0"/>
+        <w:spacing w:before="1" w:lineRule="auto"/>
+        <w:rPr>
           <w:i w:val="1"/>
           <w:iCs w:val="1"/>
           <w:sz w:val="24"/>
           <w:szCs w:val="24"/>
-          <w:rtl w:val="0"/>
-        </w:rPr>
-        <w:br w:type="textWrapping"/>
-        <w:br w:type="textWrapping"/>
-      </w:r>
-      <w:r>
-        <w:rPr>
-          <w:sz w:val="24"/>
-          <w:szCs w:val="24"/>
-          <w:rtl w:val="0"/>
-        </w:rPr>
-        <w:t xml:space="preserve">HELLO</w:t>
-      </w:r>
-      <w:r>
-        <w:rPr>
-          <w:sz w:val="24"/>
-          <w:szCs w:val="24"/>
-          <w:rtl w:val="0"/>
-        </w:rPr>
-        <w:t xml:space="preserve">? HELLLOOO?!? </w:t>
+        </w:rPr>
+      </w:pPr>
+      <w:r>
+        <w:rPr>
+          <w:rtl w:val="0"/>
+        </w:rPr>
       </w:r>
     </w:p>
     <w:p>
@@ -9155,8 +9244,19 @@
       </w:pPr>
       <w:r>
         <w:rPr>
-          <w:rtl w:val="0"/>
-        </w:rPr>
+          <w:sz w:val="24"/>
+          <w:szCs w:val="24"/>
+          <w:rtl w:val="0"/>
+        </w:rPr>
+        <w:t xml:space="preserve">HELLO</w:t>
+      </w:r>
+      <w:r>
+        <w:rPr>
+          <w:sz w:val="24"/>
+          <w:szCs w:val="24"/>
+          <w:rtl w:val="0"/>
+        </w:rPr>
+        <w:t xml:space="preserve">? HELLLOOO?!? </w:t>
       </w:r>
     </w:p>
     <w:p>
@@ -9170,6 +9270,21 @@
       </w:pPr>
       <w:r>
         <w:rPr>
+          <w:rtl w:val="0"/>
+        </w:rPr>
+      </w:r>
+    </w:p>
+    <w:p>
+      <w:pPr>
+        <w:widowControl w:val="0"/>
+        <w:spacing w:before="1" w:lineRule="auto"/>
+        <w:rPr>
+          <w:sz w:val="24"/>
+          <w:szCs w:val="24"/>
+        </w:rPr>
+      </w:pPr>
+      <w:r>
+        <w:rPr>
           <w:sz w:val="24"/>
           <w:szCs w:val="24"/>
           <w:rtl w:val="0"/>
@@ -9244,8 +9359,22 @@
           <w:rtl w:val="0"/>
         </w:rPr>
         <w:t xml:space="preserve">I didn’t forget, you’re the guy who didn’t like musicals!</w:t>
-        <w:br w:type="textWrapping"/>
-        <w:br w:type="textWrapping"/>
+      </w:r>
+    </w:p>
+    <w:p>
+      <w:pPr>
+        <w:spacing w:after="200" w:lineRule="auto"/>
+        <w:rPr>
+          <w:sz w:val="24"/>
+          <w:szCs w:val="24"/>
+        </w:rPr>
+      </w:pPr>
+      <w:r>
+        <w:rPr>
+          <w:sz w:val="24"/>
+          <w:szCs w:val="24"/>
+          <w:rtl w:val="0"/>
+        </w:rPr>
         <w:t xml:space="preserve">Paul, right?</w:t>
       </w:r>
     </w:p>
@@ -12081,23 +12210,6 @@
           <w:rtl w:val="0"/>
         </w:rPr>
         <w:t xml:space="preserve">Get back in the vehicle.</w:t>
-      </w:r>
-    </w:p>
-    <w:p>
-      <w:pPr>
-        <w:spacing w:after="200" w:lineRule="auto"/>
-        <w:rPr>
-          <w:sz w:val="24"/>
-          <w:szCs w:val="24"/>
-        </w:rPr>
-      </w:pPr>
-      <w:r>
-        <w:rPr>
-          <w:sz w:val="24"/>
-          <w:szCs w:val="24"/>
-          <w:rtl w:val="0"/>
-        </w:rPr>
-        <w:t xml:space="preserve">What vehicle?</w:t>
       </w:r>
     </w:p>
     <w:p>
@@ -18482,7 +18594,7 @@
         <w:t xml:space="preserve">Deb’s being weird? What is she doing? </w:t>
         <w:br w:type="textWrapping"/>
         <w:br w:type="textWrapping"/>
-        <w:t xml:space="preserve">Alice, listen to me. You gotta run away from her. </w:t>
+        <w:t xml:space="preserve">Oh god Alice, listen to me. You gotta run away from her right now.</w:t>
         <w:br w:type="textWrapping"/>
         <w:br w:type="textWrapping"/>
         <w:t xml:space="preserve">You understand? You run far far away… </w:t>
@@ -18491,7 +18603,7 @@
         <w:t xml:space="preserve">No! This isn’t about me not liking Deb! </w:t>
         <w:br w:type="textWrapping"/>
         <w:br w:type="textWrapping"/>
-        <w:t xml:space="preserve">Just trust me! You gotta run and hide! Where are you?</w:t>
+        <w:t xml:space="preserve">You gotta run and hide! Where are you?</w:t>
         <w:br w:type="textWrapping"/>
         <w:br w:type="textWrapping"/>
         <w:t xml:space="preserve">Ok. You stay there. I’m coming to get you.</w:t>
@@ -18582,13 +18694,31 @@
         </w:rPr>
       </w:pPr>
       <w:commentRangeStart w:id="10"/>
-      <w:r>
-        <w:rPr>
-          <w:sz w:val="24"/>
-          <w:szCs w:val="24"/>
-          <w:rtl w:val="0"/>
-        </w:rPr>
-        <w:t xml:space="preserve">FUCK! I’m taking the car. I gotta get to Hatchetfield High. </w:t>
+      <w:commentRangeStart w:id="11"/>
+      <w:r>
+        <w:rPr>
+          <w:sz w:val="24"/>
+          <w:szCs w:val="24"/>
+          <w:rtl w:val="0"/>
+        </w:rPr>
+        <w:t xml:space="preserve">FUCK! I’m taking the car, give me the keys.</w:t>
+      </w:r>
+    </w:p>
+    <w:p>
+      <w:pPr>
+        <w:spacing w:after="200" w:lineRule="auto"/>
+        <w:rPr>
+          <w:sz w:val="24"/>
+          <w:szCs w:val="24"/>
+        </w:rPr>
+      </w:pPr>
+      <w:r>
+        <w:rPr>
+          <w:sz w:val="24"/>
+          <w:szCs w:val="24"/>
+          <w:rtl w:val="0"/>
+        </w:rPr>
+        <w:t xml:space="preserve"> I gotta get to Hatchetfield High. </w:t>
       </w:r>
     </w:p>
     <w:p>
@@ -18610,6 +18740,10 @@
       <w:commentRangeEnd w:id="10"/>
       <w:r>
         <w:commentReference w:id="10"/>
+      </w:r>
+      <w:commentRangeEnd w:id="11"/>
+      <w:r>
+        <w:commentReference w:id="11"/>
       </w:r>
       <w:r>
         <w:rPr>
@@ -19099,7 +19233,7 @@
         </w:rPr>
         <w:t xml:space="preserve">Which is why I’m gonna go with you to </w:t>
       </w:r>
-      <w:commentRangeStart w:id="11"/>
+      <w:commentRangeStart w:id="12"/>
       <w:r>
         <w:rPr>
           <w:sz w:val="24"/>
@@ -19108,9 +19242,9 @@
         </w:rPr>
         <w:t xml:space="preserve">bring your daughter back.</w:t>
       </w:r>
-      <w:commentRangeEnd w:id="11"/>
-      <w:r>
-        <w:commentReference w:id="11"/>
+      <w:commentRangeEnd w:id="12"/>
+      <w:r>
+        <w:commentReference w:id="12"/>
       </w:r>
       <w:r>
         <w:rPr>
@@ -19534,30 +19668,32 @@
           <w:szCs w:val="24"/>
         </w:rPr>
       </w:pPr>
-      <w:commentRangeStart w:id="12"/>
-      <w:r>
-        <w:rPr>
-          <w:sz w:val="24"/>
-          <w:szCs w:val="24"/>
-          <w:rtl w:val="0"/>
-        </w:rPr>
-        <w:t xml:space="preserve">Sorry. You know, </w:t>
-      </w:r>
-      <w:r>
-        <w:rPr>
-          <w:sz w:val="24"/>
-          <w:szCs w:val="24"/>
-          <w:rtl w:val="0"/>
-        </w:rPr>
-        <w:t xml:space="preserve">Alice</w:t>
-      </w:r>
-      <w:r>
-        <w:rPr>
-          <w:sz w:val="24"/>
-          <w:szCs w:val="24"/>
-          <w:rtl w:val="0"/>
-        </w:rPr>
-        <w:t xml:space="preserve">, she’s a good kid, Paul. </w:t>
+      <w:commentRangeStart w:id="13"/>
+      <w:commentRangeStart w:id="14"/>
+      <w:r>
+        <w:rPr>
+          <w:sz w:val="24"/>
+          <w:szCs w:val="24"/>
+          <w:rtl w:val="0"/>
+        </w:rPr>
+        <w:t xml:space="preserve">Sorry.</w:t>
+      </w:r>
+    </w:p>
+    <w:p>
+      <w:pPr>
+        <w:spacing w:after="200" w:lineRule="auto"/>
+        <w:rPr>
+          <w:sz w:val="24"/>
+          <w:szCs w:val="24"/>
+        </w:rPr>
+      </w:pPr>
+      <w:r>
+        <w:rPr>
+          <w:sz w:val="24"/>
+          <w:szCs w:val="24"/>
+          <w:rtl w:val="0"/>
+        </w:rPr>
+        <w:t xml:space="preserve">You know, Alice is a good kid Paul.</w:t>
         <w:br w:type="textWrapping"/>
         <w:br w:type="textWrapping"/>
         <w:t xml:space="preserve">She’s smart, and I respect her choices, </w:t>
@@ -19587,11 +19723,15 @@
         <w:t xml:space="preserve">She’s always on her phone, and I don’t know… </w:t>
         <w:br w:type="textWrapping"/>
         <w:br w:type="textWrapping"/>
-        <w:t xml:space="preserve">I just think Alice could do so much better.</w:t>
-      </w:r>
-      <w:commentRangeEnd w:id="12"/>
-      <w:r>
-        <w:commentReference w:id="12"/>
+        <w:t xml:space="preserve">I think Alice could do so much better.</w:t>
+      </w:r>
+      <w:commentRangeEnd w:id="13"/>
+      <w:r>
+        <w:commentReference w:id="13"/>
+      </w:r>
+      <w:commentRangeEnd w:id="14"/>
+      <w:r>
+        <w:commentReference w:id="14"/>
       </w:r>
       <w:r>
         <w:rPr>
@@ -19677,7 +19817,7 @@
         </w:rPr>
         <w:t xml:space="preserve">Heck! I think </w:t>
       </w:r>
-      <w:commentRangeStart w:id="13"/>
+      <w:commentRangeStart w:id="15"/>
       <w:r>
         <w:rPr>
           <w:sz w:val="24"/>
@@ -19701,11 +19841,28 @@
           <w:szCs w:val="24"/>
           <w:rtl w:val="0"/>
         </w:rPr>
-        <w:t xml:space="preserve">Paul, I’m the reason she’s trapped here. Oh god, it’s my fault.</w:t>
-      </w:r>
-      <w:commentRangeEnd w:id="13"/>
-      <w:r>
-        <w:commentReference w:id="13"/>
+        <w:t xml:space="preserve">Oh god Paul, I’m the reason she’s trapped here.</w:t>
+      </w:r>
+    </w:p>
+    <w:p>
+      <w:pPr>
+        <w:spacing w:after="200" w:lineRule="auto"/>
+        <w:rPr>
+          <w:sz w:val="24"/>
+          <w:szCs w:val="24"/>
+        </w:rPr>
+      </w:pPr>
+      <w:r>
+        <w:rPr>
+          <w:sz w:val="24"/>
+          <w:szCs w:val="24"/>
+          <w:rtl w:val="0"/>
+        </w:rPr>
+        <w:t xml:space="preserve">Oh god, it’s my fault.</w:t>
+      </w:r>
+      <w:commentRangeEnd w:id="15"/>
+      <w:r>
+        <w:commentReference w:id="15"/>
       </w:r>
       <w:r>
         <w:rPr>
@@ -20726,7 +20883,7 @@
         </w:rPr>
         <w:t xml:space="preserve">Bill, whatever you’re thinking, </w:t>
       </w:r>
-      <w:commentRangeStart w:id="14"/>
+      <w:commentRangeStart w:id="16"/>
       <w:r>
         <w:rPr>
           <w:sz w:val="24"/>
@@ -20735,9 +20892,9 @@
         </w:rPr>
         <w:t xml:space="preserve">don’t</w:t>
       </w:r>
-      <w:commentRangeEnd w:id="14"/>
-      <w:r>
-        <w:commentReference w:id="14"/>
+      <w:commentRangeEnd w:id="16"/>
+      <w:r>
+        <w:commentReference w:id="16"/>
       </w:r>
       <w:r>
         <w:rPr>
@@ -21514,7 +21671,7 @@
         </w:rPr>
         <w:t xml:space="preserve">And it </w:t>
       </w:r>
-      <w:commentRangeStart w:id="15"/>
+      <w:commentRangeStart w:id="17"/>
       <w:r>
         <w:rPr>
           <w:sz w:val="24"/>
@@ -21523,9 +21680,9 @@
         </w:rPr>
         <w:t xml:space="preserve">wants</w:t>
       </w:r>
-      <w:commentRangeEnd w:id="15"/>
-      <w:r>
-        <w:commentReference w:id="15"/>
+      <w:commentRangeEnd w:id="17"/>
+      <w:r>
+        <w:commentReference w:id="17"/>
       </w:r>
       <w:r>
         <w:rPr>
@@ -21578,7 +21735,7 @@
           <w:szCs w:val="24"/>
         </w:rPr>
       </w:pPr>
-      <w:commentRangeStart w:id="16"/>
+      <w:commentRangeStart w:id="18"/>
       <w:r>
         <w:rPr>
           <w:sz w:val="24"/>
@@ -21587,9 +21744,9 @@
         </w:rPr>
         <w:t xml:space="preserve">Imagine</w:t>
       </w:r>
-      <w:commentRangeEnd w:id="16"/>
-      <w:r>
-        <w:commentReference w:id="16"/>
+      <w:commentRangeEnd w:id="18"/>
+      <w:r>
+        <w:commentReference w:id="18"/>
       </w:r>
       <w:r>
         <w:rPr>
@@ -21820,7 +21977,7 @@
         </w:rPr>
         <w:t xml:space="preserve">You can never be too </w:t>
       </w:r>
-      <w:commentRangeStart w:id="17"/>
+      <w:commentRangeStart w:id="19"/>
       <w:r>
         <w:rPr>
           <w:sz w:val="24"/>
@@ -21829,9 +21986,9 @@
         </w:rPr>
         <w:t xml:space="preserve">careful</w:t>
       </w:r>
-      <w:commentRangeEnd w:id="17"/>
-      <w:r>
-        <w:commentReference w:id="17"/>
+      <w:commentRangeEnd w:id="19"/>
+      <w:r>
+        <w:commentReference w:id="19"/>
       </w:r>
       <w:r>
         <w:rPr>
@@ -26807,7 +26964,7 @@
           <w:szCs w:val="24"/>
           <w:rtl w:val="0"/>
         </w:rPr>
-        <w:t xml:space="preserve">We served bad coffee, cuz we didn’t care… </w:t>
+        <w:t xml:space="preserve">Because we didn’t care… </w:t>
       </w:r>
     </w:p>
     <w:p>
@@ -26841,7 +26998,7 @@
           <w:szCs w:val="24"/>
           <w:rtl w:val="0"/>
         </w:rPr>
-        <w:t xml:space="preserve">You may have drank some of my spit, and I’m sorry for that. </w:t>
+        <w:t xml:space="preserve">You probably drank some of my spit, and I’m sorry for that. </w:t>
       </w:r>
     </w:p>
     <w:p>
@@ -28236,7 +28393,7 @@
           <w:szCs w:val="24"/>
           <w:rtl w:val="0"/>
         </w:rPr>
-        <w:t xml:space="preserve">All you gotta do is give up your choice!</w:t>
+        <w:t xml:space="preserve">You just gotta give up your choice!</w:t>
       </w:r>
     </w:p>
     <w:p>
@@ -28679,6 +28836,23 @@
           <w:rtl w:val="0"/>
         </w:rPr>
         <w:t xml:space="preserve">Let it out, let it out, let it out!</w:t>
+      </w:r>
+    </w:p>
+    <w:p>
+      <w:pPr>
+        <w:spacing w:after="200" w:lineRule="auto"/>
+        <w:rPr>
+          <w:sz w:val="24"/>
+          <w:szCs w:val="24"/>
+        </w:rPr>
+      </w:pPr>
+      <w:r>
+        <w:rPr>
+          <w:sz w:val="24"/>
+          <w:szCs w:val="24"/>
+          <w:rtl w:val="0"/>
+        </w:rPr>
+        <w:t xml:space="preserve">Just let it out, let it out, let it out!</w:t>
       </w:r>
     </w:p>
     <w:p>
@@ -29853,23 +30027,23 @@
           <w:szCs w:val="24"/>
           <w:rtl w:val="0"/>
         </w:rPr>
-        <w:t xml:space="preserve">Paul, stop…You’re </w:t>
-      </w:r>
-      <w:r>
-        <w:rPr>
-          <w:sz w:val="24"/>
-          <w:szCs w:val="24"/>
-          <w:rtl w:val="0"/>
-        </w:rPr>
-        <w:t xml:space="preserve">frightening me</w:t>
-      </w:r>
-      <w:r>
-        <w:rPr>
-          <w:sz w:val="24"/>
-          <w:szCs w:val="24"/>
-          <w:rtl w:val="0"/>
-        </w:rPr>
-        <w:t xml:space="preserve">!</w:t>
+        <w:t xml:space="preserve">Paul, stop…You’re freaking</w:t>
+      </w:r>
+      <w:r>
+        <w:rPr>
+          <w:sz w:val="24"/>
+          <w:szCs w:val="24"/>
+          <w:rtl w:val="0"/>
+        </w:rPr>
+        <w:t xml:space="preserve"> me</w:t>
+      </w:r>
+      <w:r>
+        <w:rPr>
+          <w:sz w:val="24"/>
+          <w:szCs w:val="24"/>
+          <w:rtl w:val="0"/>
+        </w:rPr>
+        <w:t xml:space="preserve"> out!</w:t>
       </w:r>
     </w:p>
     <w:p>
@@ -29971,24 +30145,7 @@
           <w:szCs w:val="24"/>
           <w:rtl w:val="0"/>
         </w:rPr>
-        <w:t xml:space="preserve">Stay the fuck away from me!</w:t>
-      </w:r>
-    </w:p>
-    <w:p>
-      <w:pPr>
-        <w:spacing w:after="200" w:lineRule="auto"/>
-        <w:rPr>
-          <w:sz w:val="24"/>
-          <w:szCs w:val="24"/>
-        </w:rPr>
-      </w:pPr>
-      <w:r>
-        <w:rPr>
-          <w:sz w:val="24"/>
-          <w:szCs w:val="24"/>
-          <w:rtl w:val="0"/>
-        </w:rPr>
-        <w:t xml:space="preserve">Stay away from me! You’re not Paul! You’re one of them!</w:t>
+        <w:t xml:space="preserve">No! Get away from me! You’re not Paul! You’re one of them!</w:t>
       </w:r>
     </w:p>
     <w:p>
@@ -31466,7 +31623,7 @@
       </w:r>
     </w:p>
   </w:comment>
-  <w:comment w:author="Like That" w:id="12" w:date="2026-06-30T17:58:47Z">
+  <w:comment w:author="Ophir Carmel" w:id="11" w:date="2026-07-05T13:21:57Z">
     <w:p>
       <w:pPr>
         <w:keepNext w:val="0"/>
@@ -31517,11 +31674,125 @@
           <w:vertAlign w:val="baseline"/>
           <w:rtl w:val="1"/>
         </w:rPr>
-        <w:t xml:space="preserve">אופיר</w:t>
+        <w:t xml:space="preserve">שיניתי</w:t>
+      </w:r>
+      <w:r>
+        <w:rPr>
+          <w:rFonts w:ascii="Arial" w:cs="Arial" w:eastAsia="Arial" w:hAnsi="Arial"/>
+          <w:b w:val="0"/>
+          <w:bCs w:val="0"/>
+          <w:i w:val="0"/>
+          <w:iCs w:val="0"/>
+          <w:smallCaps w:val="0"/>
+          <w:strike w:val="0"/>
+          <w:color w:val="000000"/>
+          <w:sz w:val="22"/>
+          <w:szCs w:val="22"/>
+          <w:u w:val="none"/>
+          <w:shd w:fill="auto" w:val="clear"/>
+          <w:vertAlign w:val="baseline"/>
+          <w:rtl w:val="1"/>
+        </w:rPr>
+        <w:t xml:space="preserve"> </w:t>
+      </w:r>
+      <w:r>
+        <w:rPr>
+          <w:rFonts w:ascii="Arial" w:cs="Arial" w:eastAsia="Arial" w:hAnsi="Arial"/>
+          <w:b w:val="0"/>
+          <w:bCs w:val="0"/>
+          <w:i w:val="0"/>
+          <w:iCs w:val="0"/>
+          <w:smallCaps w:val="0"/>
+          <w:strike w:val="0"/>
+          <w:color w:val="000000"/>
+          <w:sz w:val="22"/>
+          <w:szCs w:val="22"/>
+          <w:u w:val="none"/>
+          <w:shd w:fill="auto" w:val="clear"/>
+          <w:vertAlign w:val="baseline"/>
+          <w:rtl w:val="1"/>
+        </w:rPr>
+        <w:t xml:space="preserve">קצת</w:t>
+      </w:r>
+      <w:r>
+        <w:rPr>
+          <w:rFonts w:ascii="Arial" w:cs="Arial" w:eastAsia="Arial" w:hAnsi="Arial"/>
+          <w:b w:val="0"/>
+          <w:bCs w:val="0"/>
+          <w:i w:val="0"/>
+          <w:iCs w:val="0"/>
+          <w:smallCaps w:val="0"/>
+          <w:strike w:val="0"/>
+          <w:color w:val="000000"/>
+          <w:sz w:val="22"/>
+          <w:szCs w:val="22"/>
+          <w:u w:val="none"/>
+          <w:shd w:fill="auto" w:val="clear"/>
+          <w:vertAlign w:val="baseline"/>
+          <w:rtl w:val="1"/>
+        </w:rPr>
+        <w:t xml:space="preserve"> </w:t>
+      </w:r>
+      <w:r>
+        <w:rPr>
+          <w:rFonts w:ascii="Arial" w:cs="Arial" w:eastAsia="Arial" w:hAnsi="Arial"/>
+          <w:b w:val="0"/>
+          <w:bCs w:val="0"/>
+          <w:i w:val="0"/>
+          <w:iCs w:val="0"/>
+          <w:smallCaps w:val="0"/>
+          <w:strike w:val="0"/>
+          <w:color w:val="000000"/>
+          <w:sz w:val="22"/>
+          <w:szCs w:val="22"/>
+          <w:u w:val="none"/>
+          <w:shd w:fill="auto" w:val="clear"/>
+          <w:vertAlign w:val="baseline"/>
+          <w:rtl w:val="1"/>
+        </w:rPr>
+        <w:t xml:space="preserve">שימו</w:t>
+      </w:r>
+      <w:r>
+        <w:rPr>
+          <w:rFonts w:ascii="Arial" w:cs="Arial" w:eastAsia="Arial" w:hAnsi="Arial"/>
+          <w:b w:val="0"/>
+          <w:bCs w:val="0"/>
+          <w:i w:val="0"/>
+          <w:iCs w:val="0"/>
+          <w:smallCaps w:val="0"/>
+          <w:strike w:val="0"/>
+          <w:color w:val="000000"/>
+          <w:sz w:val="22"/>
+          <w:szCs w:val="22"/>
+          <w:u w:val="none"/>
+          <w:shd w:fill="auto" w:val="clear"/>
+          <w:vertAlign w:val="baseline"/>
+          <w:rtl w:val="1"/>
+        </w:rPr>
+        <w:t xml:space="preserve"> </w:t>
+      </w:r>
+      <w:r>
+        <w:rPr>
+          <w:rFonts w:ascii="Arial" w:cs="Arial" w:eastAsia="Arial" w:hAnsi="Arial"/>
+          <w:b w:val="0"/>
+          <w:bCs w:val="0"/>
+          <w:i w:val="0"/>
+          <w:iCs w:val="0"/>
+          <w:smallCaps w:val="0"/>
+          <w:strike w:val="0"/>
+          <w:color w:val="000000"/>
+          <w:sz w:val="22"/>
+          <w:szCs w:val="22"/>
+          <w:u w:val="none"/>
+          <w:shd w:fill="auto" w:val="clear"/>
+          <w:vertAlign w:val="baseline"/>
+          <w:rtl w:val="1"/>
+        </w:rPr>
+        <w:t xml:space="preserve">במצגת</w:t>
       </w:r>
     </w:p>
   </w:comment>
-  <w:comment w:author="Like That" w:id="13" w:date="2026-06-30T17:59:04Z">
+  <w:comment w:author="Like That" w:id="13" w:date="2026-06-30T17:58:47Z">
     <w:p>
       <w:pPr>
         <w:keepNext w:val="0"/>
@@ -31576,7 +31847,7 @@
       </w:r>
     </w:p>
   </w:comment>
-  <w:comment w:author="Like That" w:id="11" w:date="2026-06-30T17:54:19Z">
+  <w:comment w:author="Ophir Carmel" w:id="14" w:date="2026-07-05T13:23:56Z">
     <w:p>
       <w:pPr>
         <w:keepNext w:val="0"/>
@@ -31627,11 +31898,49 @@
           <w:vertAlign w:val="baseline"/>
           <w:rtl w:val="1"/>
         </w:rPr>
-        <w:t xml:space="preserve">עידוצ</w:t>
+        <w:t xml:space="preserve">שיניתי</w:t>
+      </w:r>
+      <w:r>
+        <w:rPr>
+          <w:rFonts w:ascii="Arial" w:cs="Arial" w:eastAsia="Arial" w:hAnsi="Arial"/>
+          <w:b w:val="0"/>
+          <w:bCs w:val="0"/>
+          <w:i w:val="0"/>
+          <w:iCs w:val="0"/>
+          <w:smallCaps w:val="0"/>
+          <w:strike w:val="0"/>
+          <w:color w:val="000000"/>
+          <w:sz w:val="22"/>
+          <w:szCs w:val="22"/>
+          <w:u w:val="none"/>
+          <w:shd w:fill="auto" w:val="clear"/>
+          <w:vertAlign w:val="baseline"/>
+          <w:rtl w:val="1"/>
+        </w:rPr>
+        <w:t xml:space="preserve"> </w:t>
+      </w:r>
+      <w:r>
+        <w:rPr>
+          <w:rFonts w:ascii="Arial" w:cs="Arial" w:eastAsia="Arial" w:hAnsi="Arial"/>
+          <w:b w:val="0"/>
+          <w:bCs w:val="0"/>
+          <w:i w:val="0"/>
+          <w:iCs w:val="0"/>
+          <w:smallCaps w:val="0"/>
+          <w:strike w:val="0"/>
+          <w:color w:val="000000"/>
+          <w:sz w:val="22"/>
+          <w:szCs w:val="22"/>
+          <w:u w:val="none"/>
+          <w:shd w:fill="auto" w:val="clear"/>
+          <w:vertAlign w:val="baseline"/>
+          <w:rtl w:val="1"/>
+        </w:rPr>
+        <w:t xml:space="preserve">קצת</w:t>
       </w:r>
     </w:p>
   </w:comment>
-  <w:comment w:author="Like That" w:id="15" w:date="2026-06-30T18:05:50Z">
+  <w:comment w:author="Like That" w:id="15" w:date="2026-06-30T17:59:04Z">
     <w:p>
       <w:pPr>
         <w:keepNext w:val="0"/>
@@ -31682,11 +31991,11 @@
           <w:vertAlign w:val="baseline"/>
           <w:rtl w:val="1"/>
         </w:rPr>
-        <w:t xml:space="preserve">ברקת</w:t>
+        <w:t xml:space="preserve">אופיר</w:t>
       </w:r>
     </w:p>
   </w:comment>
-  <w:comment w:author="Like That" w:id="16" w:date="2026-06-30T18:06:19Z">
+  <w:comment w:author="Like That" w:id="12" w:date="2026-06-30T17:54:19Z">
     <w:p>
       <w:pPr>
         <w:keepNext w:val="0"/>
@@ -31737,11 +32046,11 @@
           <w:vertAlign w:val="baseline"/>
           <w:rtl w:val="1"/>
         </w:rPr>
-        <w:t xml:space="preserve">מתן</w:t>
+        <w:t xml:space="preserve">עידוצ</w:t>
       </w:r>
     </w:p>
   </w:comment>
-  <w:comment w:author="Like That" w:id="17" w:date="2026-06-30T18:07:27Z">
+  <w:comment w:author="Like That" w:id="17" w:date="2026-06-30T18:05:50Z">
     <w:p>
       <w:pPr>
         <w:keepNext w:val="0"/>
@@ -31792,106 +32101,11 @@
           <w:vertAlign w:val="baseline"/>
           <w:rtl w:val="1"/>
         </w:rPr>
-        <w:t xml:space="preserve">גל</w:t>
-      </w:r>
-      <w:r>
-        <w:rPr>
-          <w:rFonts w:ascii="Arial" w:cs="Arial" w:eastAsia="Arial" w:hAnsi="Arial"/>
-          <w:b w:val="0"/>
-          <w:bCs w:val="0"/>
-          <w:i w:val="0"/>
-          <w:iCs w:val="0"/>
-          <w:smallCaps w:val="0"/>
-          <w:strike w:val="0"/>
-          <w:color w:val="000000"/>
-          <w:sz w:val="22"/>
-          <w:szCs w:val="22"/>
-          <w:u w:val="none"/>
-          <w:shd w:fill="auto" w:val="clear"/>
-          <w:vertAlign w:val="baseline"/>
-          <w:rtl w:val="1"/>
-        </w:rPr>
-        <w:t xml:space="preserve"> </w:t>
-      </w:r>
-      <w:r>
-        <w:rPr>
-          <w:rFonts w:ascii="Arial" w:cs="Arial" w:eastAsia="Arial" w:hAnsi="Arial"/>
-          <w:b w:val="0"/>
-          <w:bCs w:val="0"/>
-          <w:i w:val="0"/>
-          <w:iCs w:val="0"/>
-          <w:smallCaps w:val="0"/>
-          <w:strike w:val="0"/>
-          <w:color w:val="000000"/>
-          <w:sz w:val="22"/>
-          <w:szCs w:val="22"/>
-          <w:u w:val="none"/>
-          <w:shd w:fill="auto" w:val="clear"/>
-          <w:vertAlign w:val="baseline"/>
-          <w:rtl w:val="1"/>
-        </w:rPr>
-        <w:t xml:space="preserve">בימוי</w:t>
-      </w:r>
-      <w:r>
-        <w:rPr>
-          <w:rFonts w:ascii="Arial" w:cs="Arial" w:eastAsia="Arial" w:hAnsi="Arial"/>
-          <w:b w:val="0"/>
-          <w:bCs w:val="0"/>
-          <w:i w:val="0"/>
-          <w:iCs w:val="0"/>
-          <w:smallCaps w:val="0"/>
-          <w:strike w:val="0"/>
-          <w:color w:val="000000"/>
-          <w:sz w:val="22"/>
-          <w:szCs w:val="22"/>
-          <w:u w:val="none"/>
-          <w:shd w:fill="auto" w:val="clear"/>
-          <w:vertAlign w:val="baseline"/>
-          <w:rtl w:val="1"/>
-        </w:rPr>
-        <w:t xml:space="preserve">- </w:t>
-      </w:r>
-      <w:r>
-        <w:rPr>
-          <w:rFonts w:ascii="Arial" w:cs="Arial" w:eastAsia="Arial" w:hAnsi="Arial"/>
-          <w:b w:val="0"/>
-          <w:bCs w:val="0"/>
-          <w:i w:val="0"/>
-          <w:iCs w:val="0"/>
-          <w:smallCaps w:val="0"/>
-          <w:strike w:val="0"/>
-          <w:color w:val="000000"/>
-          <w:sz w:val="22"/>
-          <w:szCs w:val="22"/>
-          <w:u w:val="none"/>
-          <w:shd w:fill="auto" w:val="clear"/>
-          <w:vertAlign w:val="baseline"/>
-          <w:rtl w:val="1"/>
-        </w:rPr>
-        <w:t xml:space="preserve">דיקציה</w:t>
-      </w:r>
-      <w:r>
-        <w:rPr>
-          <w:rFonts w:ascii="Arial" w:cs="Arial" w:eastAsia="Arial" w:hAnsi="Arial"/>
-          <w:b w:val="0"/>
-          <w:bCs w:val="0"/>
-          <w:i w:val="0"/>
-          <w:iCs w:val="0"/>
-          <w:smallCaps w:val="0"/>
-          <w:strike w:val="0"/>
-          <w:color w:val="000000"/>
-          <w:sz w:val="22"/>
-          <w:szCs w:val="22"/>
-          <w:u w:val="none"/>
-          <w:shd w:fill="auto" w:val="clear"/>
-          <w:vertAlign w:val="baseline"/>
-          <w:rtl w:val="0"/>
-        </w:rPr>
-        <w:t xml:space="preserve">!</w:t>
+        <w:t xml:space="preserve">ברקת</w:t>
       </w:r>
     </w:p>
   </w:comment>
-  <w:comment w:author="Like That" w:id="4" w:date="2026-06-30T17:24:04Z">
+  <w:comment w:author="Like That" w:id="18" w:date="2026-06-30T18:06:19Z">
     <w:p>
       <w:pPr>
         <w:keepNext w:val="0"/>
@@ -31942,125 +32156,11 @@
           <w:vertAlign w:val="baseline"/>
           <w:rtl w:val="1"/>
         </w:rPr>
-        <w:t xml:space="preserve">מנוסח</w:t>
-      </w:r>
-      <w:r>
-        <w:rPr>
-          <w:rFonts w:ascii="Arial" w:cs="Arial" w:eastAsia="Arial" w:hAnsi="Arial"/>
-          <w:b w:val="0"/>
-          <w:bCs w:val="0"/>
-          <w:i w:val="0"/>
-          <w:iCs w:val="0"/>
-          <w:smallCaps w:val="0"/>
-          <w:strike w:val="0"/>
-          <w:color w:val="000000"/>
-          <w:sz w:val="22"/>
-          <w:szCs w:val="22"/>
-          <w:u w:val="none"/>
-          <w:shd w:fill="auto" w:val="clear"/>
-          <w:vertAlign w:val="baseline"/>
-          <w:rtl w:val="1"/>
-        </w:rPr>
-        <w:t xml:space="preserve"> </w:t>
-      </w:r>
-      <w:r>
-        <w:rPr>
-          <w:rFonts w:ascii="Arial" w:cs="Arial" w:eastAsia="Arial" w:hAnsi="Arial"/>
-          <w:b w:val="0"/>
-          <w:bCs w:val="0"/>
-          <w:i w:val="0"/>
-          <w:iCs w:val="0"/>
-          <w:smallCaps w:val="0"/>
-          <w:strike w:val="0"/>
-          <w:color w:val="000000"/>
-          <w:sz w:val="22"/>
-          <w:szCs w:val="22"/>
-          <w:u w:val="none"/>
-          <w:shd w:fill="auto" w:val="clear"/>
-          <w:vertAlign w:val="baseline"/>
-          <w:rtl w:val="1"/>
-        </w:rPr>
-        <w:t xml:space="preserve">כשאלה</w:t>
-      </w:r>
-      <w:r>
-        <w:rPr>
-          <w:rFonts w:ascii="Arial" w:cs="Arial" w:eastAsia="Arial" w:hAnsi="Arial"/>
-          <w:b w:val="0"/>
-          <w:bCs w:val="0"/>
-          <w:i w:val="0"/>
-          <w:iCs w:val="0"/>
-          <w:smallCaps w:val="0"/>
-          <w:strike w:val="0"/>
-          <w:color w:val="000000"/>
-          <w:sz w:val="22"/>
-          <w:szCs w:val="22"/>
-          <w:u w:val="none"/>
-          <w:shd w:fill="auto" w:val="clear"/>
-          <w:vertAlign w:val="baseline"/>
-          <w:rtl w:val="1"/>
-        </w:rPr>
-        <w:t xml:space="preserve"> </w:t>
-      </w:r>
-      <w:r>
-        <w:rPr>
-          <w:rFonts w:ascii="Arial" w:cs="Arial" w:eastAsia="Arial" w:hAnsi="Arial"/>
-          <w:b w:val="0"/>
-          <w:bCs w:val="0"/>
-          <w:i w:val="0"/>
-          <w:iCs w:val="0"/>
-          <w:smallCaps w:val="0"/>
-          <w:strike w:val="0"/>
-          <w:color w:val="000000"/>
-          <w:sz w:val="22"/>
-          <w:szCs w:val="22"/>
-          <w:u w:val="none"/>
-          <w:shd w:fill="auto" w:val="clear"/>
-          <w:vertAlign w:val="baseline"/>
-          <w:rtl w:val="1"/>
-        </w:rPr>
-        <w:t xml:space="preserve">שלא</w:t>
-      </w:r>
-      <w:r>
-        <w:rPr>
-          <w:rFonts w:ascii="Arial" w:cs="Arial" w:eastAsia="Arial" w:hAnsi="Arial"/>
-          <w:b w:val="0"/>
-          <w:bCs w:val="0"/>
-          <w:i w:val="0"/>
-          <w:iCs w:val="0"/>
-          <w:smallCaps w:val="0"/>
-          <w:strike w:val="0"/>
-          <w:color w:val="000000"/>
-          <w:sz w:val="22"/>
-          <w:szCs w:val="22"/>
-          <w:u w:val="none"/>
-          <w:shd w:fill="auto" w:val="clear"/>
-          <w:vertAlign w:val="baseline"/>
-          <w:rtl w:val="1"/>
-        </w:rPr>
-        <w:t xml:space="preserve"> </w:t>
-      </w:r>
-      <w:r>
-        <w:rPr>
-          <w:rFonts w:ascii="Arial" w:cs="Arial" w:eastAsia="Arial" w:hAnsi="Arial"/>
-          <w:b w:val="0"/>
-          <w:bCs w:val="0"/>
-          <w:i w:val="0"/>
-          <w:iCs w:val="0"/>
-          <w:smallCaps w:val="0"/>
-          <w:strike w:val="0"/>
-          <w:color w:val="000000"/>
-          <w:sz w:val="22"/>
-          <w:szCs w:val="22"/>
-          <w:u w:val="none"/>
-          <w:shd w:fill="auto" w:val="clear"/>
-          <w:vertAlign w:val="baseline"/>
-          <w:rtl w:val="1"/>
-        </w:rPr>
-        <w:t xml:space="preserve">תפסתי</w:t>
+        <w:t xml:space="preserve">מתן</w:t>
       </w:r>
     </w:p>
   </w:comment>
-  <w:comment w:author="יותם סבירסקי" w:id="5" w:date="2026-06-30T20:40:02Z">
+  <w:comment w:author="Like That" w:id="19" w:date="2026-06-30T18:07:27Z">
     <w:p>
       <w:pPr>
         <w:keepNext w:val="0"/>
@@ -32096,30 +32196,6 @@
       </w:pPr>
       <w:r>
         <w:rPr>
-          <w:rtl w:val="0"/>
-        </w:rPr>
-      </w:r>
-      <w:r>
-        <w:rPr>
-          <w:rFonts w:ascii="Arial" w:cs="Arial" w:eastAsia="Arial" w:hAnsi="Arial"/>
-          <w:b w:val="0"/>
-          <w:bCs w:val="0"/>
-          <w:i w:val="0"/>
-          <w:iCs w:val="0"/>
-          <w:smallCaps w:val="0"/>
-          <w:strike w:val="0"/>
-          <w:color w:val="000000"/>
-          <w:sz w:val="22"/>
-          <w:szCs w:val="22"/>
-          <w:u w:val="none"/>
-          <w:shd w:fill="auto" w:val="clear"/>
-          <w:vertAlign w:val="baseline"/>
-          <w:rtl w:val="0"/>
-        </w:rPr>
-        <w:t xml:space="preserve">_</w:t>
-      </w:r>
-      <w:r>
-        <w:rPr>
           <w:rFonts w:ascii="Arial" w:cs="Arial" w:eastAsia="Arial" w:hAnsi="Arial"/>
           <w:b w:val="0"/>
           <w:bCs w:val="0"/>
@@ -32135,7 +32211,7 @@
           <w:vertAlign w:val="baseline"/>
           <w:rtl w:val="1"/>
         </w:rPr>
-        <w:t xml:space="preserve">סומן</w:t>
+        <w:t xml:space="preserve">גל</w:t>
       </w:r>
       <w:r>
         <w:rPr>
@@ -32173,7 +32249,7 @@
           <w:vertAlign w:val="baseline"/>
           <w:rtl w:val="1"/>
         </w:rPr>
-        <w:t xml:space="preserve">כהסתיים</w:t>
+        <w:t xml:space="preserve">בימוי</w:t>
       </w:r>
       <w:r>
         <w:rPr>
@@ -32190,13 +32266,51 @@
           <w:u w:val="none"/>
           <w:shd w:fill="auto" w:val="clear"/>
           <w:vertAlign w:val="baseline"/>
-          <w:rtl w:val="0"/>
-        </w:rPr>
-        <w:t xml:space="preserve">_</w:t>
+          <w:rtl w:val="1"/>
+        </w:rPr>
+        <w:t xml:space="preserve">- </w:t>
+      </w:r>
+      <w:r>
+        <w:rPr>
+          <w:rFonts w:ascii="Arial" w:cs="Arial" w:eastAsia="Arial" w:hAnsi="Arial"/>
+          <w:b w:val="0"/>
+          <w:bCs w:val="0"/>
+          <w:i w:val="0"/>
+          <w:iCs w:val="0"/>
+          <w:smallCaps w:val="0"/>
+          <w:strike w:val="0"/>
+          <w:color w:val="000000"/>
+          <w:sz w:val="22"/>
+          <w:szCs w:val="22"/>
+          <w:u w:val="none"/>
+          <w:shd w:fill="auto" w:val="clear"/>
+          <w:vertAlign w:val="baseline"/>
+          <w:rtl w:val="1"/>
+        </w:rPr>
+        <w:t xml:space="preserve">דיקציה</w:t>
+      </w:r>
+      <w:r>
+        <w:rPr>
+          <w:rFonts w:ascii="Arial" w:cs="Arial" w:eastAsia="Arial" w:hAnsi="Arial"/>
+          <w:b w:val="0"/>
+          <w:bCs w:val="0"/>
+          <w:i w:val="0"/>
+          <w:iCs w:val="0"/>
+          <w:smallCaps w:val="0"/>
+          <w:strike w:val="0"/>
+          <w:color w:val="000000"/>
+          <w:sz w:val="22"/>
+          <w:szCs w:val="22"/>
+          <w:u w:val="none"/>
+          <w:shd w:fill="auto" w:val="clear"/>
+          <w:vertAlign w:val="baseline"/>
+          <w:rtl w:val="0"/>
+        </w:rPr>
+        <w:t xml:space="preserve">!</w:t>
       </w:r>
     </w:p>
   </w:comment>
-  <w:comment w:author="יותם סבירסקי" w:id="6" w:date="2026-06-30T20:40:06Z">
+  <w:comment w:author="Like That" w:id="4" w:date="2026-06-30T17:24:04Z">
     <w:p>
       <w:pPr>
         <w:keepNext w:val="0"/>
@@ -32232,30 +32346,6 @@
       </w:pPr>
       <w:r>
         <w:rPr>
-          <w:rtl w:val="0"/>
-        </w:rPr>
-      </w:r>
-      <w:r>
-        <w:rPr>
-          <w:rFonts w:ascii="Arial" w:cs="Arial" w:eastAsia="Arial" w:hAnsi="Arial"/>
-          <w:b w:val="0"/>
-          <w:bCs w:val="0"/>
-          <w:i w:val="0"/>
-          <w:iCs w:val="0"/>
-          <w:smallCaps w:val="0"/>
-          <w:strike w:val="0"/>
-          <w:color w:val="000000"/>
-          <w:sz w:val="22"/>
-          <w:szCs w:val="22"/>
-          <w:u w:val="none"/>
-          <w:shd w:fill="auto" w:val="clear"/>
-          <w:vertAlign w:val="baseline"/>
-          <w:rtl w:val="0"/>
-        </w:rPr>
-        <w:t xml:space="preserve">_</w:t>
-      </w:r>
-      <w:r>
-        <w:rPr>
           <w:rFonts w:ascii="Arial" w:cs="Arial" w:eastAsia="Arial" w:hAnsi="Arial"/>
           <w:b w:val="0"/>
           <w:bCs w:val="0"/>
@@ -32271,7 +32361,7 @@
           <w:vertAlign w:val="baseline"/>
           <w:rtl w:val="1"/>
         </w:rPr>
-        <w:t xml:space="preserve">נפתח</w:t>
+        <w:t xml:space="preserve">מנוסח</w:t>
       </w:r>
       <w:r>
         <w:rPr>
@@ -32309,7 +32399,7 @@
           <w:vertAlign w:val="baseline"/>
           <w:rtl w:val="1"/>
         </w:rPr>
-        <w:t xml:space="preserve">מחדש</w:t>
+        <w:t xml:space="preserve">כשאלה</w:t>
       </w:r>
       <w:r>
         <w:rPr>
@@ -32326,13 +32416,70 @@
           <w:u w:val="none"/>
           <w:shd w:fill="auto" w:val="clear"/>
           <w:vertAlign w:val="baseline"/>
-          <w:rtl w:val="0"/>
-        </w:rPr>
-        <w:t xml:space="preserve">_</w:t>
+          <w:rtl w:val="1"/>
+        </w:rPr>
+        <w:t xml:space="preserve"> </w:t>
+      </w:r>
+      <w:r>
+        <w:rPr>
+          <w:rFonts w:ascii="Arial" w:cs="Arial" w:eastAsia="Arial" w:hAnsi="Arial"/>
+          <w:b w:val="0"/>
+          <w:bCs w:val="0"/>
+          <w:i w:val="0"/>
+          <w:iCs w:val="0"/>
+          <w:smallCaps w:val="0"/>
+          <w:strike w:val="0"/>
+          <w:color w:val="000000"/>
+          <w:sz w:val="22"/>
+          <w:szCs w:val="22"/>
+          <w:u w:val="none"/>
+          <w:shd w:fill="auto" w:val="clear"/>
+          <w:vertAlign w:val="baseline"/>
+          <w:rtl w:val="1"/>
+        </w:rPr>
+        <w:t xml:space="preserve">שלא</w:t>
+      </w:r>
+      <w:r>
+        <w:rPr>
+          <w:rFonts w:ascii="Arial" w:cs="Arial" w:eastAsia="Arial" w:hAnsi="Arial"/>
+          <w:b w:val="0"/>
+          <w:bCs w:val="0"/>
+          <w:i w:val="0"/>
+          <w:iCs w:val="0"/>
+          <w:smallCaps w:val="0"/>
+          <w:strike w:val="0"/>
+          <w:color w:val="000000"/>
+          <w:sz w:val="22"/>
+          <w:szCs w:val="22"/>
+          <w:u w:val="none"/>
+          <w:shd w:fill="auto" w:val="clear"/>
+          <w:vertAlign w:val="baseline"/>
+          <w:rtl w:val="1"/>
+        </w:rPr>
+        <w:t xml:space="preserve"> </w:t>
+      </w:r>
+      <w:r>
+        <w:rPr>
+          <w:rFonts w:ascii="Arial" w:cs="Arial" w:eastAsia="Arial" w:hAnsi="Arial"/>
+          <w:b w:val="0"/>
+          <w:bCs w:val="0"/>
+          <w:i w:val="0"/>
+          <w:iCs w:val="0"/>
+          <w:smallCaps w:val="0"/>
+          <w:strike w:val="0"/>
+          <w:color w:val="000000"/>
+          <w:sz w:val="22"/>
+          <w:szCs w:val="22"/>
+          <w:u w:val="none"/>
+          <w:shd w:fill="auto" w:val="clear"/>
+          <w:vertAlign w:val="baseline"/>
+          <w:rtl w:val="1"/>
+        </w:rPr>
+        <w:t xml:space="preserve">תפסתי</w:t>
       </w:r>
     </w:p>
   </w:comment>
-  <w:comment w:author="Like That" w:id="7" w:date="2026-06-30T17:45:47Z">
+  <w:comment w:author="יותם סבירסקי" w:id="5" w:date="2026-06-30T20:40:02Z">
     <w:p>
       <w:pPr>
         <w:keepNext w:val="0"/>
@@ -32368,6 +32515,30 @@
       </w:pPr>
       <w:r>
         <w:rPr>
+          <w:rtl w:val="0"/>
+        </w:rPr>
+      </w:r>
+      <w:r>
+        <w:rPr>
+          <w:rFonts w:ascii="Arial" w:cs="Arial" w:eastAsia="Arial" w:hAnsi="Arial"/>
+          <w:b w:val="0"/>
+          <w:bCs w:val="0"/>
+          <w:i w:val="0"/>
+          <w:iCs w:val="0"/>
+          <w:smallCaps w:val="0"/>
+          <w:strike w:val="0"/>
+          <w:color w:val="000000"/>
+          <w:sz w:val="22"/>
+          <w:szCs w:val="22"/>
+          <w:u w:val="none"/>
+          <w:shd w:fill="auto" w:val="clear"/>
+          <w:vertAlign w:val="baseline"/>
+          <w:rtl w:val="0"/>
+        </w:rPr>
+        <w:t xml:space="preserve">_</w:t>
+      </w:r>
+      <w:r>
+        <w:rPr>
           <w:rFonts w:ascii="Arial" w:cs="Arial" w:eastAsia="Arial" w:hAnsi="Arial"/>
           <w:b w:val="0"/>
           <w:bCs w:val="0"/>
@@ -32383,11 +32554,68 @@
           <w:vertAlign w:val="baseline"/>
           <w:rtl w:val="1"/>
         </w:rPr>
-        <w:t xml:space="preserve">ברקת</w:t>
+        <w:t xml:space="preserve">סומן</w:t>
+      </w:r>
+      <w:r>
+        <w:rPr>
+          <w:rFonts w:ascii="Arial" w:cs="Arial" w:eastAsia="Arial" w:hAnsi="Arial"/>
+          <w:b w:val="0"/>
+          <w:bCs w:val="0"/>
+          <w:i w:val="0"/>
+          <w:iCs w:val="0"/>
+          <w:smallCaps w:val="0"/>
+          <w:strike w:val="0"/>
+          <w:color w:val="000000"/>
+          <w:sz w:val="22"/>
+          <w:szCs w:val="22"/>
+          <w:u w:val="none"/>
+          <w:shd w:fill="auto" w:val="clear"/>
+          <w:vertAlign w:val="baseline"/>
+          <w:rtl w:val="1"/>
+        </w:rPr>
+        <w:t xml:space="preserve"> </w:t>
+      </w:r>
+      <w:r>
+        <w:rPr>
+          <w:rFonts w:ascii="Arial" w:cs="Arial" w:eastAsia="Arial" w:hAnsi="Arial"/>
+          <w:b w:val="0"/>
+          <w:bCs w:val="0"/>
+          <w:i w:val="0"/>
+          <w:iCs w:val="0"/>
+          <w:smallCaps w:val="0"/>
+          <w:strike w:val="0"/>
+          <w:color w:val="000000"/>
+          <w:sz w:val="22"/>
+          <w:szCs w:val="22"/>
+          <w:u w:val="none"/>
+          <w:shd w:fill="auto" w:val="clear"/>
+          <w:vertAlign w:val="baseline"/>
+          <w:rtl w:val="1"/>
+        </w:rPr>
+        <w:t xml:space="preserve">כהסתיים</w:t>
+      </w:r>
+      <w:r>
+        <w:rPr>
+          <w:rFonts w:ascii="Arial" w:cs="Arial" w:eastAsia="Arial" w:hAnsi="Arial"/>
+          <w:b w:val="0"/>
+          <w:bCs w:val="0"/>
+          <w:i w:val="0"/>
+          <w:iCs w:val="0"/>
+          <w:smallCaps w:val="0"/>
+          <w:strike w:val="0"/>
+          <w:color w:val="000000"/>
+          <w:sz w:val="22"/>
+          <w:szCs w:val="22"/>
+          <w:u w:val="none"/>
+          <w:shd w:fill="auto" w:val="clear"/>
+          <w:vertAlign w:val="baseline"/>
+          <w:rtl w:val="0"/>
+        </w:rPr>
+        <w:t xml:space="preserve">_</w:t>
       </w:r>
     </w:p>
   </w:comment>
-  <w:comment w:author="Like That" w:id="0" w:date="2026-06-30T17:01:15Z">
+  <w:comment w:author="יותם סבירסקי" w:id="6" w:date="2026-06-30T20:40:06Z">
     <w:p>
       <w:pPr>
         <w:keepNext w:val="0"/>
@@ -32423,6 +32651,30 @@
       </w:pPr>
       <w:r>
         <w:rPr>
+          <w:rtl w:val="0"/>
+        </w:rPr>
+      </w:r>
+      <w:r>
+        <w:rPr>
+          <w:rFonts w:ascii="Arial" w:cs="Arial" w:eastAsia="Arial" w:hAnsi="Arial"/>
+          <w:b w:val="0"/>
+          <w:bCs w:val="0"/>
+          <w:i w:val="0"/>
+          <w:iCs w:val="0"/>
+          <w:smallCaps w:val="0"/>
+          <w:strike w:val="0"/>
+          <w:color w:val="000000"/>
+          <w:sz w:val="22"/>
+          <w:szCs w:val="22"/>
+          <w:u w:val="none"/>
+          <w:shd w:fill="auto" w:val="clear"/>
+          <w:vertAlign w:val="baseline"/>
+          <w:rtl w:val="0"/>
+        </w:rPr>
+        <w:t xml:space="preserve">_</w:t>
+      </w:r>
+      <w:r>
+        <w:rPr>
           <w:rFonts w:ascii="Arial" w:cs="Arial" w:eastAsia="Arial" w:hAnsi="Arial"/>
           <w:b w:val="0"/>
           <w:bCs w:val="0"/>
@@ -32438,7 +32690,7 @@
           <w:vertAlign w:val="baseline"/>
           <w:rtl w:val="1"/>
         </w:rPr>
-        <w:t xml:space="preserve">להינעל</w:t>
+        <w:t xml:space="preserve">נפתח</w:t>
       </w:r>
       <w:r>
         <w:rPr>
@@ -32476,8 +32728,63 @@
           <w:vertAlign w:val="baseline"/>
           <w:rtl w:val="1"/>
         </w:rPr>
-        <w:t xml:space="preserve">על</w:t>
-      </w:r>
+        <w:t xml:space="preserve">מחדש</w:t>
+      </w:r>
+      <w:r>
+        <w:rPr>
+          <w:rFonts w:ascii="Arial" w:cs="Arial" w:eastAsia="Arial" w:hAnsi="Arial"/>
+          <w:b w:val="0"/>
+          <w:bCs w:val="0"/>
+          <w:i w:val="0"/>
+          <w:iCs w:val="0"/>
+          <w:smallCaps w:val="0"/>
+          <w:strike w:val="0"/>
+          <w:color w:val="000000"/>
+          <w:sz w:val="22"/>
+          <w:szCs w:val="22"/>
+          <w:u w:val="none"/>
+          <w:shd w:fill="auto" w:val="clear"/>
+          <w:vertAlign w:val="baseline"/>
+          <w:rtl w:val="0"/>
+        </w:rPr>
+        <w:t xml:space="preserve">_</w:t>
+      </w:r>
+    </w:p>
+  </w:comment>
+  <w:comment w:author="Like That" w:id="7" w:date="2026-06-30T17:45:47Z">
+    <w:p>
+      <w:pPr>
+        <w:keepNext w:val="0"/>
+        <w:keepLines w:val="0"/>
+        <w:pageBreakBefore w:val="0"/>
+        <w:widowControl w:val="0"/>
+        <w:pBdr>
+          <w:top w:space="0" w:sz="0" w:val="nil"/>
+          <w:left w:space="0" w:sz="0" w:val="nil"/>
+          <w:bottom w:space="0" w:sz="0" w:val="nil"/>
+          <w:right w:space="0" w:sz="0" w:val="nil"/>
+          <w:between w:space="0" w:sz="0" w:val="nil"/>
+        </w:pBdr>
+        <w:shd w:fill="auto" w:val="clear"/>
+        <w:spacing w:after="0" w:before="0" w:line="240" w:lineRule="auto"/>
+        <w:ind w:left="0" w:right="0" w:firstLine="0"/>
+        <w:jc w:val="left"/>
+        <w:rPr>
+          <w:rFonts w:ascii="Arial" w:cs="Arial" w:eastAsia="Arial" w:hAnsi="Arial"/>
+          <w:b w:val="0"/>
+          <w:bCs w:val="0"/>
+          <w:i w:val="0"/>
+          <w:iCs w:val="0"/>
+          <w:smallCaps w:val="0"/>
+          <w:strike w:val="0"/>
+          <w:color w:val="000000"/>
+          <w:sz w:val="22"/>
+          <w:szCs w:val="22"/>
+          <w:u w:val="none"/>
+          <w:shd w:fill="auto" w:val="clear"/>
+          <w:vertAlign w:val="baseline"/>
+        </w:rPr>
+      </w:pPr>
       <w:r>
         <w:rPr>
           <w:rFonts w:ascii="Arial" w:cs="Arial" w:eastAsia="Arial" w:hAnsi="Arial"/>
@@ -32495,8 +32802,44 @@
           <w:vertAlign w:val="baseline"/>
           <w:rtl w:val="1"/>
         </w:rPr>
-        <w:t xml:space="preserve"> </w:t>
-      </w:r>
+        <w:t xml:space="preserve">ברקת</w:t>
+      </w:r>
+    </w:p>
+  </w:comment>
+  <w:comment w:author="Like That" w:id="0" w:date="2026-06-30T17:01:15Z">
+    <w:p>
+      <w:pPr>
+        <w:keepNext w:val="0"/>
+        <w:keepLines w:val="0"/>
+        <w:pageBreakBefore w:val="0"/>
+        <w:widowControl w:val="0"/>
+        <w:pBdr>
+          <w:top w:space="0" w:sz="0" w:val="nil"/>
+          <w:left w:space="0" w:sz="0" w:val="nil"/>
+          <w:bottom w:space="0" w:sz="0" w:val="nil"/>
+          <w:right w:space="0" w:sz="0" w:val="nil"/>
+          <w:between w:space="0" w:sz="0" w:val="nil"/>
+        </w:pBdr>
+        <w:shd w:fill="auto" w:val="clear"/>
+        <w:spacing w:after="0" w:before="0" w:line="240" w:lineRule="auto"/>
+        <w:ind w:left="0" w:right="0" w:firstLine="0"/>
+        <w:jc w:val="left"/>
+        <w:rPr>
+          <w:rFonts w:ascii="Arial" w:cs="Arial" w:eastAsia="Arial" w:hAnsi="Arial"/>
+          <w:b w:val="0"/>
+          <w:bCs w:val="0"/>
+          <w:i w:val="0"/>
+          <w:iCs w:val="0"/>
+          <w:smallCaps w:val="0"/>
+          <w:strike w:val="0"/>
+          <w:color w:val="000000"/>
+          <w:sz w:val="22"/>
+          <w:szCs w:val="22"/>
+          <w:u w:val="none"/>
+          <w:shd w:fill="auto" w:val="clear"/>
+          <w:vertAlign w:val="baseline"/>
+        </w:rPr>
+      </w:pPr>
       <w:r>
         <w:rPr>
           <w:rFonts w:ascii="Arial" w:cs="Arial" w:eastAsia="Arial" w:hAnsi="Arial"/>
@@ -32514,11 +32857,87 @@
           <w:vertAlign w:val="baseline"/>
           <w:rtl w:val="1"/>
         </w:rPr>
+        <w:t xml:space="preserve">להינעל</w:t>
+      </w:r>
+      <w:r>
+        <w:rPr>
+          <w:rFonts w:ascii="Arial" w:cs="Arial" w:eastAsia="Arial" w:hAnsi="Arial"/>
+          <w:b w:val="0"/>
+          <w:bCs w:val="0"/>
+          <w:i w:val="0"/>
+          <w:iCs w:val="0"/>
+          <w:smallCaps w:val="0"/>
+          <w:strike w:val="0"/>
+          <w:color w:val="000000"/>
+          <w:sz w:val="22"/>
+          <w:szCs w:val="22"/>
+          <w:u w:val="none"/>
+          <w:shd w:fill="auto" w:val="clear"/>
+          <w:vertAlign w:val="baseline"/>
+          <w:rtl w:val="1"/>
+        </w:rPr>
+        <w:t xml:space="preserve"> </w:t>
+      </w:r>
+      <w:r>
+        <w:rPr>
+          <w:rFonts w:ascii="Arial" w:cs="Arial" w:eastAsia="Arial" w:hAnsi="Arial"/>
+          <w:b w:val="0"/>
+          <w:bCs w:val="0"/>
+          <w:i w:val="0"/>
+          <w:iCs w:val="0"/>
+          <w:smallCaps w:val="0"/>
+          <w:strike w:val="0"/>
+          <w:color w:val="000000"/>
+          <w:sz w:val="22"/>
+          <w:szCs w:val="22"/>
+          <w:u w:val="none"/>
+          <w:shd w:fill="auto" w:val="clear"/>
+          <w:vertAlign w:val="baseline"/>
+          <w:rtl w:val="1"/>
+        </w:rPr>
+        <w:t xml:space="preserve">על</w:t>
+      </w:r>
+      <w:r>
+        <w:rPr>
+          <w:rFonts w:ascii="Arial" w:cs="Arial" w:eastAsia="Arial" w:hAnsi="Arial"/>
+          <w:b w:val="0"/>
+          <w:bCs w:val="0"/>
+          <w:i w:val="0"/>
+          <w:iCs w:val="0"/>
+          <w:smallCaps w:val="0"/>
+          <w:strike w:val="0"/>
+          <w:color w:val="000000"/>
+          <w:sz w:val="22"/>
+          <w:szCs w:val="22"/>
+          <w:u w:val="none"/>
+          <w:shd w:fill="auto" w:val="clear"/>
+          <w:vertAlign w:val="baseline"/>
+          <w:rtl w:val="1"/>
+        </w:rPr>
+        <w:t xml:space="preserve"> </w:t>
+      </w:r>
+      <w:r>
+        <w:rPr>
+          <w:rFonts w:ascii="Arial" w:cs="Arial" w:eastAsia="Arial" w:hAnsi="Arial"/>
+          <w:b w:val="0"/>
+          <w:bCs w:val="0"/>
+          <w:i w:val="0"/>
+          <w:iCs w:val="0"/>
+          <w:smallCaps w:val="0"/>
+          <w:strike w:val="0"/>
+          <w:color w:val="000000"/>
+          <w:sz w:val="22"/>
+          <w:szCs w:val="22"/>
+          <w:u w:val="none"/>
+          <w:shd w:fill="auto" w:val="clear"/>
+          <w:vertAlign w:val="baseline"/>
+          <w:rtl w:val="1"/>
+        </w:rPr>
         <w:t xml:space="preserve">זה</w:t>
       </w:r>
     </w:p>
   </w:comment>
-  <w:comment w:author="Like That" w:id="14" w:date="2026-07-04T22:02:20Z">
+  <w:comment w:author="Like That" w:id="16" w:date="2026-07-04T22:02:20Z">
     <w:p>
       <w:pPr>
         <w:keepNext w:val="0"/>

</xml_diff>